<commit_message>
Update CRC onboarding plan docx files: fix errors, add hyperlinks, fill gaps
- Fix "Knowledge Hub" → "Knowledge Base" throughout both files
- Add ~30 hyperlinks to Resource columns pointing to ri-muhc.mintlify.app
- CR plan: add 6 new rows (PI Pathway, ISF, Site Setup, Preparing Submission,
  Nagano workflow, Close-Out); fix Protocol Deviations reference
- LR plan: add 6 new rows (MUHC Authorization filing, ÉFVP review, PI Pathway,
  CANTRAIN Bootcamp, Quality Essentials, Team exercises); fix OACIS scope,
  consent header for Level V ÉFVP scenario, CANTRAIN module count

Co-Authored-By: Claude Opus 4.6 <noreply@anthropic.com>
</commit_message>
<xml_diff>
--- a/public/downloads/crc-onboarding-plan-cr.docx
+++ b/public/downloads/crc-onboarding-plan-cr.docx
@@ -3410,16 +3410,353 @@
               <w:spacing w:after="0"/>
               <w:jc w:val="left"/>
             </w:pPr>
-            <w:hyperlink w:history="1" r:id="rIdclwmuxcfjtggu6ylougrb">
+            <w:hyperlink r:id="rId9">
               <w:r>
                 <w:rPr>
-                  <w:rFonts w:ascii="Arial" w:cs="Arial" w:eastAsia="Arial" w:hAnsi="Arial"/>
-                  <w:color w:val="2B9CE2"/>
-                  <w:sz w:val="14"/>
-                  <w:szCs w:val="14"/>
+                  <w:color w:val="0563C1"/>
                   <w:u w:val="single"/>
                 </w:rPr>
-                <w:t xml:space="preserve">Knowledge Hub</w:t>
+                <w:t xml:space="preserve">Knowledge Base</w:t>
+              </w:r>
+            </w:hyperlink>
+          </w:p>
+        </w:tc>
+        <w:tc>
+          <w:tcPr>
+            <w:tcW w:type="dxa" w:w="1200"/>
+            <w:tcBorders>
+              <w:top w:val="single" w:color="E0DFE6" w:sz="1"/>
+              <w:left w:val="single" w:color="E0DFE6" w:sz="1"/>
+              <w:bottom w:val="single" w:color="E0DFE6" w:sz="1"/>
+              <w:right w:val="single" w:color="E0DFE6" w:sz="1"/>
+            </w:tcBorders>
+            <w:shd w:fill="F8F8F8" w:val="clear"/>
+            <w:tcMar>
+              <w:top w:type="dxa" w:w="50"/>
+              <w:left w:type="dxa" w:w="80"/>
+              <w:bottom w:type="dxa" w:w="50"/>
+              <w:right w:type="dxa" w:w="80"/>
+            </w:tcMar>
+            <w:vAlign w:val="top"/>
+          </w:tcPr>
+          <w:p>
+            <w:pPr>
+              <w:spacing w:after="0"/>
+              <w:jc w:val="center"/>
+            </w:pPr>
+            <w:r>
+              <w:rPr>
+                <w:rFonts w:ascii="Arial" w:cs="Arial" w:eastAsia="Arial" w:hAnsi="Arial"/>
+                <w:b w:val="false"/>
+                <w:bCs w:val="false"/>
+                <w:i w:val="false"/>
+                <w:iCs w:val="false"/>
+                <w:color w:val="474650"/>
+                <w:sz w:val="14"/>
+                <w:szCs w:val="14"/>
+              </w:rPr>
+              <w:t xml:space="preserve">Self-study</w:t>
+            </w:r>
+          </w:p>
+        </w:tc>
+        <w:tc>
+          <w:tcPr>
+            <w:tcW w:type="dxa" w:w="800"/>
+            <w:tcBorders>
+              <w:top w:val="single" w:color="E0DFE6" w:sz="1"/>
+              <w:left w:val="single" w:color="E0DFE6" w:sz="1"/>
+              <w:bottom w:val="single" w:color="E0DFE6" w:sz="1"/>
+              <w:right w:val="single" w:color="E0DFE6" w:sz="1"/>
+            </w:tcBorders>
+            <w:shd w:fill="F8F8F8" w:val="clear"/>
+            <w:tcMar>
+              <w:top w:type="dxa" w:w="50"/>
+              <w:left w:type="dxa" w:w="80"/>
+              <w:bottom w:type="dxa" w:w="50"/>
+              <w:right w:type="dxa" w:w="80"/>
+            </w:tcMar>
+            <w:vAlign w:val="top"/>
+          </w:tcPr>
+          <w:p>
+            <w:pPr>
+              <w:spacing w:after="0"/>
+              <w:jc w:val="center"/>
+            </w:pPr>
+            <w:r>
+              <w:rPr>
+                <w:rFonts w:ascii="Arial" w:cs="Arial" w:eastAsia="Arial" w:hAnsi="Arial"/>
+                <w:b w:val="false"/>
+                <w:bCs w:val="false"/>
+                <w:i w:val="false"/>
+                <w:iCs w:val="false"/>
+                <w:color w:val="474650"/>
+                <w:sz w:val="14"/>
+                <w:szCs w:val="14"/>
+              </w:rPr>
+              <w:t xml:space="preserve">All</w:t>
+            </w:r>
+          </w:p>
+        </w:tc>
+        <w:tc>
+          <w:tcPr>
+            <w:tcW w:type="dxa" w:w="1100"/>
+            <w:tcBorders>
+              <w:top w:val="single" w:color="E0DFE6" w:sz="1"/>
+              <w:left w:val="single" w:color="E0DFE6" w:sz="1"/>
+              <w:bottom w:val="single" w:color="E0DFE6" w:sz="1"/>
+              <w:right w:val="single" w:color="E0DFE6" w:sz="1"/>
+            </w:tcBorders>
+            <w:shd w:fill="F8F8F8" w:val="clear"/>
+            <w:tcMar>
+              <w:top w:type="dxa" w:w="50"/>
+              <w:left w:type="dxa" w:w="80"/>
+              <w:bottom w:type="dxa" w:w="50"/>
+              <w:right w:type="dxa" w:w="80"/>
+            </w:tcMar>
+            <w:vAlign w:val="top"/>
+          </w:tcPr>
+          <w:p>
+            <w:pPr>
+              <w:spacing w:after="0"/>
+              <w:jc w:val="left"/>
+            </w:pPr>
+            <w:r>
+              <w:rPr>
+                <w:rFonts w:ascii="Arial" w:cs="Arial" w:eastAsia="Arial" w:hAnsi="Arial"/>
+                <w:b w:val="false"/>
+                <w:bCs w:val="false"/>
+                <w:i w:val="false"/>
+                <w:iCs w:val="false"/>
+                <w:color w:val="474650"/>
+                <w:sz w:val="14"/>
+                <w:szCs w:val="14"/>
+              </w:rPr>
+              <w:t xml:space="preserve"/>
+            </w:r>
+          </w:p>
+        </w:tc>
+        <w:tc>
+          <w:tcPr>
+            <w:tcW w:type="dxa" w:w="1100"/>
+            <w:tcBorders>
+              <w:top w:val="single" w:color="E0DFE6" w:sz="1"/>
+              <w:left w:val="single" w:color="E0DFE6" w:sz="1"/>
+              <w:bottom w:val="single" w:color="E0DFE6" w:sz="1"/>
+              <w:right w:val="single" w:color="E0DFE6" w:sz="1"/>
+            </w:tcBorders>
+            <w:shd w:fill="F8F8F8" w:val="clear"/>
+            <w:tcMar>
+              <w:top w:type="dxa" w:w="50"/>
+              <w:left w:type="dxa" w:w="80"/>
+              <w:bottom w:type="dxa" w:w="50"/>
+              <w:right w:type="dxa" w:w="80"/>
+            </w:tcMar>
+            <w:vAlign w:val="top"/>
+          </w:tcPr>
+          <w:p>
+            <w:pPr>
+              <w:spacing w:after="0"/>
+              <w:jc w:val="left"/>
+            </w:pPr>
+            <w:r>
+              <w:rPr>
+                <w:rFonts w:ascii="Arial" w:cs="Arial" w:eastAsia="Arial" w:hAnsi="Arial"/>
+                <w:b w:val="false"/>
+                <w:bCs w:val="false"/>
+                <w:i w:val="false"/>
+                <w:iCs w:val="false"/>
+                <w:color w:val="474650"/>
+                <w:sz w:val="14"/>
+                <w:szCs w:val="14"/>
+              </w:rPr>
+              <w:t xml:space="preserve"/>
+            </w:r>
+          </w:p>
+        </w:tc>
+        <w:tc>
+          <w:tcPr>
+            <w:tcW w:type="dxa" w:w="800"/>
+            <w:tcBorders>
+              <w:top w:val="single" w:color="E0DFE6" w:sz="1"/>
+              <w:left w:val="single" w:color="E0DFE6" w:sz="1"/>
+              <w:bottom w:val="single" w:color="E0DFE6" w:sz="1"/>
+              <w:right w:val="single" w:color="E0DFE6" w:sz="1"/>
+            </w:tcBorders>
+            <w:shd w:fill="F8F8F8" w:val="clear"/>
+            <w:tcMar>
+              <w:top w:type="dxa" w:w="50"/>
+              <w:left w:type="dxa" w:w="80"/>
+              <w:bottom w:type="dxa" w:w="50"/>
+              <w:right w:type="dxa" w:w="80"/>
+            </w:tcMar>
+            <w:vAlign w:val="top"/>
+          </w:tcPr>
+          <w:p>
+            <w:pPr>
+              <w:spacing w:after="0"/>
+              <w:jc w:val="center"/>
+            </w:pPr>
+            <w:r>
+              <w:rPr>
+                <w:rFonts w:ascii="Arial" w:cs="Arial" w:eastAsia="Arial" w:hAnsi="Arial"/>
+                <w:b w:val="false"/>
+                <w:bCs w:val="false"/>
+                <w:i w:val="false"/>
+                <w:iCs w:val="false"/>
+                <w:color w:val="474650"/>
+                <w:sz w:val="14"/>
+                <w:szCs w:val="14"/>
+              </w:rPr>
+              <w:t xml:space="preserve"/>
+            </w:r>
+          </w:p>
+        </w:tc>
+        <w:tc>
+          <w:tcPr>
+            <w:tcW w:type="dxa" w:w="800"/>
+            <w:tcBorders>
+              <w:top w:val="single" w:color="E0DFE6" w:sz="1"/>
+              <w:left w:val="single" w:color="E0DFE6" w:sz="1"/>
+              <w:bottom w:val="single" w:color="E0DFE6" w:sz="1"/>
+              <w:right w:val="single" w:color="E0DFE6" w:sz="1"/>
+            </w:tcBorders>
+            <w:shd w:fill="F8F8F8" w:val="clear"/>
+            <w:tcMar>
+              <w:top w:type="dxa" w:w="50"/>
+              <w:left w:type="dxa" w:w="80"/>
+              <w:bottom w:type="dxa" w:w="50"/>
+              <w:right w:type="dxa" w:w="80"/>
+            </w:tcMar>
+            <w:vAlign w:val="top"/>
+          </w:tcPr>
+          <w:p>
+            <w:pPr>
+              <w:spacing w:after="0"/>
+              <w:jc w:val="center"/>
+            </w:pPr>
+            <w:r>
+              <w:rPr>
+                <w:rFonts w:ascii="Arial" w:cs="Arial" w:eastAsia="Arial" w:hAnsi="Arial"/>
+                <w:b w:val="false"/>
+                <w:bCs w:val="false"/>
+                <w:i w:val="false"/>
+                <w:iCs w:val="false"/>
+                <w:color w:val="474650"/>
+                <w:sz w:val="14"/>
+                <w:szCs w:val="14"/>
+              </w:rPr>
+              <w:t xml:space="preserve"/>
+            </w:r>
+          </w:p>
+        </w:tc>
+        <w:tc>
+          <w:tcPr>
+            <w:tcW w:type="dxa" w:w="1080"/>
+            <w:tcBorders>
+              <w:top w:val="single" w:color="E0DFE6" w:sz="1"/>
+              <w:left w:val="single" w:color="E0DFE6" w:sz="1"/>
+              <w:bottom w:val="single" w:color="E0DFE6" w:sz="1"/>
+              <w:right w:val="single" w:color="E0DFE6" w:sz="1"/>
+            </w:tcBorders>
+            <w:shd w:fill="F8F8F8" w:val="clear"/>
+            <w:tcMar>
+              <w:top w:type="dxa" w:w="50"/>
+              <w:left w:type="dxa" w:w="80"/>
+              <w:bottom w:type="dxa" w:w="50"/>
+              <w:right w:type="dxa" w:w="80"/>
+            </w:tcMar>
+            <w:vAlign w:val="top"/>
+          </w:tcPr>
+          <w:p>
+            <w:pPr>
+              <w:spacing w:after="0"/>
+              <w:jc w:val="left"/>
+            </w:pPr>
+            <w:r>
+              <w:rPr>
+                <w:rFonts w:ascii="Arial" w:cs="Arial" w:eastAsia="Arial" w:hAnsi="Arial"/>
+                <w:b w:val="false"/>
+                <w:bCs w:val="false"/>
+                <w:i w:val="false"/>
+                <w:iCs w:val="false"/>
+                <w:color w:val="474650"/>
+                <w:sz w:val="14"/>
+                <w:szCs w:val="14"/>
+              </w:rPr>
+              <w:t xml:space="preserve"/>
+            </w:r>
+          </w:p>
+        </w:tc>
+      </w:tr>
+      <w:tr>
+        <w:tc>
+          <w:tcPr>
+            <w:tcW w:type="dxa" w:w="4600"/>
+            <w:tcBorders>
+              <w:top w:val="single" w:color="E0DFE6" w:sz="1"/>
+              <w:left w:val="single" w:color="E0DFE6" w:sz="1"/>
+              <w:bottom w:val="single" w:color="E0DFE6" w:sz="1"/>
+              <w:right w:val="single" w:color="E0DFE6" w:sz="1"/>
+            </w:tcBorders>
+            <w:shd w:fill="F8F8F8" w:val="clear"/>
+            <w:tcMar>
+              <w:top w:type="dxa" w:w="50"/>
+              <w:left w:type="dxa" w:w="80"/>
+              <w:bottom w:type="dxa" w:w="50"/>
+              <w:right w:type="dxa" w:w="80"/>
+            </w:tcMar>
+            <w:vAlign w:val="top"/>
+          </w:tcPr>
+          <w:p>
+            <w:pPr>
+              <w:spacing w:after="0"/>
+              <w:jc w:val="left"/>
+            </w:pPr>
+            <w:r>
+              <w:rPr>
+                <w:rFonts w:ascii="Arial" w:cs="Arial" w:eastAsia="Arial" w:hAnsi="Arial"/>
+                <w:b w:val="false"/>
+                <w:bCs w:val="false"/>
+                <w:i/>
+                <w:iCs/>
+                <w:color w:val="474650"/>
+                <w:sz w:val="14"/>
+                <w:szCs w:val="14"/>
+              </w:rPr>
+              <w:t xml:space="preserve">Review the PI / QI Pathway (understand PI accountability)</w:t>
+            </w:r>
+          </w:p>
+        </w:tc>
+        <w:tc>
+          <w:tcPr>
+            <w:tcW w:type="dxa" w:w="2200"/>
+            <w:tcBorders>
+              <w:top w:val="single" w:color="E0DFE6" w:sz="1"/>
+              <w:left w:val="single" w:color="E0DFE6" w:sz="1"/>
+              <w:bottom w:val="single" w:color="E0DFE6" w:sz="1"/>
+              <w:right w:val="single" w:color="E0DFE6" w:sz="1"/>
+            </w:tcBorders>
+            <w:shd w:fill="F8F8F8" w:val="clear"/>
+            <w:tcMar>
+              <w:top w:type="dxa" w:w="50"/>
+              <w:left w:type="dxa" w:w="80"/>
+              <w:bottom w:type="dxa" w:w="50"/>
+              <w:right w:type="dxa" w:w="80"/>
+            </w:tcMar>
+            <w:vAlign w:val="top"/>
+          </w:tcPr>
+          <w:p>
+            <w:pPr>
+              <w:spacing w:after="0"/>
+              <w:jc w:val="left"/>
+            </w:pPr>
+            <w:hyperlink r:id="rId24">
+              <w:r>
+                <w:rPr>
+                  <w:color w:val="0563C1"/>
+                  <w:u w:val="single"/>
+                </w:rPr>
+                <w:t xml:space="preserve">Knowledge Base</w:t>
               </w:r>
             </w:hyperlink>
           </w:p>
@@ -4867,19 +5204,18 @@
               <w:spacing w:after="0"/>
               <w:jc w:val="left"/>
             </w:pPr>
-            <w:r>
-              <w:rPr>
-                <w:rFonts w:ascii="Arial" w:cs="Arial" w:eastAsia="Arial" w:hAnsi="Arial"/>
-                <w:b w:val="false"/>
-                <w:bCs w:val="false"/>
-                <w:i w:val="false"/>
-                <w:iCs w:val="false"/>
-                <w:color w:val="474650"/>
-                <w:sz w:val="14"/>
-                <w:szCs w:val="14"/>
-              </w:rPr>
-              <w:t xml:space="preserve">Portal → TalentLMS</w:t>
-            </w:r>
+            <w:hyperlink r:id="rId10">
+              <w:r>
+                <w:rPr>
+                  <w:color w:val="0563C1"/>
+                  <w:u w:val="single"/>
+                  <w:sz w:val="14"/>
+                  <w:szCs w:val="14"/>
+                  <w:rFonts w:ascii="Arial" w:hAnsi="Arial"/>
+                </w:rPr>
+                <w:t xml:space="preserve">TalentLMS</w:t>
+              </w:r>
+            </w:hyperlink>
           </w:p>
         </w:tc>
         <w:tc>
@@ -6879,13 +7215,10 @@
               <w:spacing w:after="0"/>
               <w:jc w:val="left"/>
             </w:pPr>
-            <w:hyperlink w:history="1" r:id="rIdv4x33yzld70h3ggqtvxbt">
+            <w:hyperlink r:id="rId11">
               <w:r>
                 <w:rPr>
-                  <w:rFonts w:ascii="Arial" w:cs="Arial" w:eastAsia="Arial" w:hAnsi="Arial"/>
-                  <w:color w:val="2B9CE2"/>
-                  <w:sz w:val="14"/>
-                  <w:szCs w:val="14"/>
+                  <w:color w:val="0563C1"/>
                   <w:u w:val="single"/>
                 </w:rPr>
                 <w:t xml:space="preserve">CANTRAIN</w:t>
@@ -8309,19 +8642,18 @@
               <w:spacing w:after="0"/>
               <w:jc w:val="left"/>
             </w:pPr>
-            <w:r>
-              <w:rPr>
-                <w:rFonts w:ascii="Arial" w:cs="Arial" w:eastAsia="Arial" w:hAnsi="Arial"/>
-                <w:b w:val="false"/>
-                <w:bCs w:val="false"/>
-                <w:i w:val="false"/>
-                <w:iCs w:val="false"/>
-                <w:color w:val="474650"/>
-                <w:sz w:val="14"/>
-                <w:szCs w:val="14"/>
-              </w:rPr>
-              <w:t xml:space="preserve">CORD</w:t>
-            </w:r>
+            <w:hyperlink r:id="rId12">
+              <w:r>
+                <w:rPr>
+                  <w:color w:val="0563C1"/>
+                  <w:u w:val="single"/>
+                  <w:sz w:val="14"/>
+                  <w:szCs w:val="14"/>
+                  <w:rFonts w:ascii="Arial" w:hAnsi="Arial"/>
+                </w:rPr>
+                <w:t xml:space="preserve">CORD</w:t>
+              </w:r>
+            </w:hyperlink>
           </w:p>
         </w:tc>
         <w:tc>
@@ -10321,13 +10653,10 @@
               <w:spacing w:after="0"/>
               <w:jc w:val="left"/>
             </w:pPr>
-            <w:hyperlink w:history="1" r:id="rId4ioq-yrhe-nfkrg_v6hyi">
+            <w:hyperlink r:id="rId13">
               <w:r>
                 <w:rPr>
-                  <w:rFonts w:ascii="Arial" w:cs="Arial" w:eastAsia="Arial" w:hAnsi="Arial"/>
-                  <w:color w:val="2B9CE2"/>
-                  <w:sz w:val="14"/>
-                  <w:szCs w:val="14"/>
+                  <w:color w:val="0563C1"/>
                   <w:u w:val="single"/>
                 </w:rPr>
                 <w:t xml:space="preserve">CRC Guide</w:t>
@@ -10664,13 +10993,10 @@
               <w:spacing w:after="0"/>
               <w:jc w:val="left"/>
             </w:pPr>
-            <w:hyperlink w:history="1" r:id="rId7fe2r_jizj-dopf6sjgrg">
+            <w:hyperlink r:id="rId14">
               <w:r>
                 <w:rPr>
-                  <w:rFonts w:ascii="Arial" w:cs="Arial" w:eastAsia="Arial" w:hAnsi="Arial"/>
-                  <w:color w:val="2B9CE2"/>
-                  <w:sz w:val="14"/>
-                  <w:szCs w:val="14"/>
+                  <w:color w:val="0563C1"/>
                   <w:u w:val="single"/>
                 </w:rPr>
                 <w:t xml:space="preserve">Nagano Guide</w:t>
@@ -11089,13 +11415,10 @@
               <w:spacing w:after="0"/>
               <w:jc w:val="left"/>
             </w:pPr>
-            <w:hyperlink w:history="1" r:id="rIdlgzxgvirynkole1uzkmzr">
+            <w:hyperlink r:id="rId13">
               <w:r>
                 <w:rPr>
-                  <w:rFonts w:ascii="Arial" w:cs="Arial" w:eastAsia="Arial" w:hAnsi="Arial"/>
-                  <w:color w:val="2B9CE2"/>
-                  <w:sz w:val="14"/>
-                  <w:szCs w:val="14"/>
+                  <w:color w:val="0563C1"/>
                   <w:u w:val="single"/>
                 </w:rPr>
                 <w:t xml:space="preserve">CRC Guide</w:t>
@@ -11457,16 +11780,13 @@
               <w:spacing w:after="0"/>
               <w:jc w:val="left"/>
             </w:pPr>
-            <w:hyperlink w:history="1" r:id="rIdd4krbuybqdbibm_pho0nb">
+            <w:hyperlink r:id="rId15">
               <w:r>
                 <w:rPr>
-                  <w:rFonts w:ascii="Arial" w:cs="Arial" w:eastAsia="Arial" w:hAnsi="Arial"/>
-                  <w:color w:val="2B9CE2"/>
-                  <w:sz w:val="14"/>
-                  <w:szCs w:val="14"/>
+                  <w:color w:val="0563C1"/>
                   <w:u w:val="single"/>
                 </w:rPr>
-                <w:t xml:space="preserve">Knowledge Hub</w:t>
+                <w:t xml:space="preserve">Knowledge Base</w:t>
               </w:r>
             </w:hyperlink>
           </w:p>
@@ -11793,13 +12113,10 @@
               <w:spacing w:after="0"/>
               <w:jc w:val="left"/>
             </w:pPr>
-            <w:hyperlink w:history="1" r:id="rIdkm2glbtflrfe89jfrtear">
+            <w:hyperlink r:id="rId11">
               <w:r>
                 <w:rPr>
-                  <w:rFonts w:ascii="Arial" w:cs="Arial" w:eastAsia="Arial" w:hAnsi="Arial"/>
-                  <w:color w:val="2B9CE2"/>
-                  <w:sz w:val="14"/>
-                  <w:szCs w:val="14"/>
+                  <w:color w:val="0563C1"/>
                   <w:u w:val="single"/>
                 </w:rPr>
                 <w:t xml:space="preserve">CANTRAIN</w:t>
@@ -12136,13 +12453,10 @@
               <w:spacing w:after="0"/>
               <w:jc w:val="left"/>
             </w:pPr>
-            <w:hyperlink w:history="1" r:id="rId4p4fjmiutdsdlvgxhvrzg">
+            <w:hyperlink r:id="rId11">
               <w:r>
                 <w:rPr>
-                  <w:rFonts w:ascii="Arial" w:cs="Arial" w:eastAsia="Arial" w:hAnsi="Arial"/>
-                  <w:color w:val="2B9CE2"/>
-                  <w:sz w:val="14"/>
-                  <w:szCs w:val="14"/>
+                  <w:color w:val="0563C1"/>
                   <w:u w:val="single"/>
                 </w:rPr>
                 <w:t xml:space="preserve">CANTRAIN</w:t>
@@ -13199,16 +13513,13 @@
               <w:spacing w:after="0"/>
               <w:jc w:val="left"/>
             </w:pPr>
-            <w:hyperlink w:history="1" r:id="rIdfzcdy0un9wgkxx8kh1eio">
+            <w:hyperlink r:id="rId16">
               <w:r>
                 <w:rPr>
-                  <w:rFonts w:ascii="Arial" w:cs="Arial" w:eastAsia="Arial" w:hAnsi="Arial"/>
-                  <w:color w:val="2B9CE2"/>
-                  <w:sz w:val="14"/>
-                  <w:szCs w:val="14"/>
+                  <w:color w:val="0563C1"/>
                   <w:u w:val="single"/>
                 </w:rPr>
-                <w:t xml:space="preserve">Knowledge Hub</w:t>
+                <w:t xml:space="preserve">Knowledge Base</w:t>
               </w:r>
             </w:hyperlink>
           </w:p>
@@ -13535,13 +13846,10 @@
               <w:spacing w:after="0"/>
               <w:jc w:val="left"/>
             </w:pPr>
-            <w:hyperlink w:history="1" r:id="rIdetjzehgft2vhwpklci2yr">
+            <w:hyperlink r:id="rId11">
               <w:r>
                 <w:rPr>
-                  <w:rFonts w:ascii="Arial" w:cs="Arial" w:eastAsia="Arial" w:hAnsi="Arial"/>
-                  <w:color w:val="2B9CE2"/>
-                  <w:sz w:val="14"/>
-                  <w:szCs w:val="14"/>
+                  <w:color w:val="0563C1"/>
                   <w:u w:val="single"/>
                 </w:rPr>
                 <w:t xml:space="preserve">CANTRAIN</w:t>
@@ -14254,16 +14562,13 @@
               <w:spacing w:after="0"/>
               <w:jc w:val="left"/>
             </w:pPr>
-            <w:hyperlink w:history="1" r:id="rIddib6u3ksuifv0gc27vafz">
+            <w:hyperlink r:id="rId17">
               <w:r>
                 <w:rPr>
-                  <w:rFonts w:ascii="Arial" w:cs="Arial" w:eastAsia="Arial" w:hAnsi="Arial"/>
-                  <w:color w:val="2B9CE2"/>
-                  <w:sz w:val="14"/>
-                  <w:szCs w:val="14"/>
+                  <w:color w:val="0563C1"/>
                   <w:u w:val="single"/>
                 </w:rPr>
-                <w:t xml:space="preserve">Knowledge Hub</w:t>
+                <w:t xml:space="preserve">Knowledge Base</w:t>
               </w:r>
             </w:hyperlink>
           </w:p>
@@ -14590,13 +14895,10 @@
               <w:spacing w:after="0"/>
               <w:jc w:val="left"/>
             </w:pPr>
-            <w:hyperlink w:history="1" r:id="rIdzoo_hxtivggmu7b6vnmrq">
+            <w:hyperlink r:id="rId11">
               <w:r>
                 <w:rPr>
-                  <w:rFonts w:ascii="Arial" w:cs="Arial" w:eastAsia="Arial" w:hAnsi="Arial"/>
-                  <w:color w:val="2B9CE2"/>
-                  <w:sz w:val="14"/>
-                  <w:szCs w:val="14"/>
+                  <w:color w:val="0563C1"/>
                   <w:u w:val="single"/>
                 </w:rPr>
                 <w:t xml:space="preserve">CANTRAIN</w:t>
@@ -14965,16 +15267,13 @@
               <w:spacing w:after="0"/>
               <w:jc w:val="left"/>
             </w:pPr>
-            <w:hyperlink w:history="1" r:id="rIdxt0_yzfdoozhw2n71qdjp">
+            <w:hyperlink r:id="rId18">
               <w:r>
                 <w:rPr>
-                  <w:rFonts w:ascii="Arial" w:cs="Arial" w:eastAsia="Arial" w:hAnsi="Arial"/>
-                  <w:color w:val="2B9CE2"/>
-                  <w:sz w:val="14"/>
-                  <w:szCs w:val="14"/>
+                  <w:color w:val="0563C1"/>
                   <w:u w:val="single"/>
                 </w:rPr>
-                <w:t xml:space="preserve">Knowledge Hub</w:t>
+                <w:t xml:space="preserve">Knowledge Base</w:t>
               </w:r>
             </w:hyperlink>
           </w:p>
@@ -15301,13 +15600,10 @@
               <w:spacing w:after="0"/>
               <w:jc w:val="left"/>
             </w:pPr>
-            <w:hyperlink w:history="1" r:id="rId5xoakvwjum-31qbdoj9zm">
+            <w:hyperlink r:id="rId11">
               <w:r>
                 <w:rPr>
-                  <w:rFonts w:ascii="Arial" w:cs="Arial" w:eastAsia="Arial" w:hAnsi="Arial"/>
-                  <w:color w:val="2B9CE2"/>
-                  <w:sz w:val="14"/>
-                  <w:szCs w:val="14"/>
+                  <w:color w:val="0563C1"/>
                   <w:u w:val="single"/>
                 </w:rPr>
                 <w:t xml:space="preserve">CANTRAIN</w:t>
@@ -15988,13 +16284,10 @@
               <w:spacing w:after="0"/>
               <w:jc w:val="left"/>
             </w:pPr>
-            <w:hyperlink w:history="1" r:id="rId6lturuoot5igg5neghwuh">
+            <w:hyperlink r:id="rId11">
               <w:r>
                 <w:rPr>
-                  <w:rFonts w:ascii="Arial" w:cs="Arial" w:eastAsia="Arial" w:hAnsi="Arial"/>
-                  <w:color w:val="2B9CE2"/>
-                  <w:sz w:val="14"/>
-                  <w:szCs w:val="14"/>
+                  <w:color w:val="0563C1"/>
                   <w:u w:val="single"/>
                 </w:rPr>
                 <w:t xml:space="preserve">CANTRAIN</w:t>
@@ -16363,16 +16656,13 @@
               <w:spacing w:after="0"/>
               <w:jc w:val="left"/>
             </w:pPr>
-            <w:hyperlink w:history="1" r:id="rIdqokwnbhv5wwpt0jumvpqo">
+            <w:hyperlink r:id="rId19">
               <w:r>
                 <w:rPr>
-                  <w:rFonts w:ascii="Arial" w:cs="Arial" w:eastAsia="Arial" w:hAnsi="Arial"/>
-                  <w:color w:val="2B9CE2"/>
-                  <w:sz w:val="14"/>
-                  <w:szCs w:val="14"/>
+                  <w:color w:val="0563C1"/>
                   <w:u w:val="single"/>
                 </w:rPr>
-                <w:t xml:space="preserve">Knowledge Hub</w:t>
+                <w:t xml:space="preserve">Knowledge Base</w:t>
               </w:r>
             </w:hyperlink>
           </w:p>
@@ -16699,13 +16989,10 @@
               <w:spacing w:after="0"/>
               <w:jc w:val="left"/>
             </w:pPr>
-            <w:hyperlink w:history="1" r:id="rIdibp5-kwxeirh-1ukbmouw">
+            <w:hyperlink r:id="rId11">
               <w:r>
                 <w:rPr>
-                  <w:rFonts w:ascii="Arial" w:cs="Arial" w:eastAsia="Arial" w:hAnsi="Arial"/>
-                  <w:color w:val="2B9CE2"/>
-                  <w:sz w:val="14"/>
-                  <w:szCs w:val="14"/>
+                  <w:color w:val="0563C1"/>
                   <w:u w:val="single"/>
                 </w:rPr>
                 <w:t xml:space="preserve">CANTRAIN</w:t>
@@ -17042,13 +17329,10 @@
               <w:spacing w:after="0"/>
               <w:jc w:val="left"/>
             </w:pPr>
-            <w:hyperlink w:history="1" r:id="rIdnxuyu4ztws7ef_evefexq">
+            <w:hyperlink r:id="rId11">
               <w:r>
                 <w:rPr>
-                  <w:rFonts w:ascii="Arial" w:cs="Arial" w:eastAsia="Arial" w:hAnsi="Arial"/>
-                  <w:color w:val="2B9CE2"/>
-                  <w:sz w:val="14"/>
-                  <w:szCs w:val="14"/>
+                  <w:color w:val="0563C1"/>
                   <w:u w:val="single"/>
                 </w:rPr>
                 <w:t xml:space="preserve">CANTRAIN</w:t>
@@ -17763,13 +18047,10 @@
               <w:spacing w:after="0"/>
               <w:jc w:val="left"/>
             </w:pPr>
-            <w:hyperlink w:history="1" r:id="rIdkowhf-emodvi3d6oycbzm">
+            <w:hyperlink r:id="rId13">
               <w:r>
                 <w:rPr>
-                  <w:rFonts w:ascii="Arial" w:cs="Arial" w:eastAsia="Arial" w:hAnsi="Arial"/>
-                  <w:color w:val="2B9CE2"/>
-                  <w:sz w:val="14"/>
-                  <w:szCs w:val="14"/>
+                  <w:color w:val="0563C1"/>
                   <w:u w:val="single"/>
                 </w:rPr>
                 <w:t xml:space="preserve">CRC Guide</w:t>
@@ -18450,13 +18731,10 @@
               <w:spacing w:after="0"/>
               <w:jc w:val="left"/>
             </w:pPr>
-            <w:hyperlink w:history="1" r:id="rIdtb5dil9qssi_gtx393f-l">
+            <w:hyperlink r:id="rId11">
               <w:r>
                 <w:rPr>
-                  <w:rFonts w:ascii="Arial" w:cs="Arial" w:eastAsia="Arial" w:hAnsi="Arial"/>
-                  <w:color w:val="2B9CE2"/>
-                  <w:sz w:val="14"/>
-                  <w:szCs w:val="14"/>
+                  <w:color w:val="0563C1"/>
                   <w:u w:val="single"/>
                 </w:rPr>
                 <w:t xml:space="preserve">CANTRAIN</w:t>
@@ -18827,13 +19105,10 @@
               <w:spacing w:after="0"/>
               <w:jc w:val="left"/>
             </w:pPr>
-            <w:hyperlink w:history="1" r:id="rId2-ddaskhyeulwvqxsrwh4">
+            <w:hyperlink r:id="rId13">
               <w:r>
                 <w:rPr>
-                  <w:rFonts w:ascii="Arial" w:cs="Arial" w:eastAsia="Arial" w:hAnsi="Arial"/>
-                  <w:color w:val="2B9CE2"/>
-                  <w:sz w:val="14"/>
-                  <w:szCs w:val="14"/>
+                  <w:color w:val="0563C1"/>
                   <w:u w:val="single"/>
                 </w:rPr>
                 <w:t xml:space="preserve">CRC Guide</w:t>
@@ -19520,7 +19795,7 @@
                 <w:sz w:val="14"/>
                 <w:szCs w:val="14"/>
               </w:rPr>
-              <w:t xml:space="preserve">Read: Protocol Deviations</w:t>
+              <w:t>Read: Reportable Events and Protocol Deviations</w:t>
             </w:r>
           </w:p>
         </w:tc>
@@ -19546,16 +19821,13 @@
               <w:spacing w:after="0"/>
               <w:jc w:val="left"/>
             </w:pPr>
-            <w:hyperlink w:history="1" r:id="rIdtji8g4i1ycylqdnd33x9x">
+            <w:hyperlink r:id="rId18">
               <w:r>
                 <w:rPr>
-                  <w:rFonts w:ascii="Arial" w:cs="Arial" w:eastAsia="Arial" w:hAnsi="Arial"/>
-                  <w:color w:val="2B9CE2"/>
-                  <w:sz w:val="14"/>
-                  <w:szCs w:val="14"/>
+                  <w:color w:val="0563C1"/>
                   <w:u w:val="single"/>
                 </w:rPr>
-                <w:t xml:space="preserve">Knowledge Hub</w:t>
+                <w:t xml:space="preserve">Knowledge Base</w:t>
               </w:r>
             </w:hyperlink>
           </w:p>
@@ -20258,16 +20530,13 @@
               <w:spacing w:after="0"/>
               <w:jc w:val="left"/>
             </w:pPr>
-            <w:hyperlink w:history="1" r:id="rIdtyhll3mabgfxlqx06puy4">
+            <w:hyperlink r:id="rId20">
               <w:r>
                 <w:rPr>
-                  <w:rFonts w:ascii="Arial" w:cs="Arial" w:eastAsia="Arial" w:hAnsi="Arial"/>
-                  <w:color w:val="2B9CE2"/>
-                  <w:sz w:val="14"/>
-                  <w:szCs w:val="14"/>
+                  <w:color w:val="0563C1"/>
                   <w:u w:val="single"/>
                 </w:rPr>
-                <w:t xml:space="preserve">Knowledge Hub</w:t>
+                <w:t xml:space="preserve">Knowledge Base</w:t>
               </w:r>
             </w:hyperlink>
           </w:p>
@@ -20592,16 +20861,13 @@
               <w:spacing w:after="0"/>
               <w:jc w:val="left"/>
             </w:pPr>
-            <w:hyperlink w:history="1" r:id="rIdkairyfo9rphte7v-5dhsa">
+            <w:hyperlink r:id="rId21">
               <w:r>
                 <w:rPr>
-                  <w:rFonts w:ascii="Arial" w:cs="Arial" w:eastAsia="Arial" w:hAnsi="Arial"/>
-                  <w:color w:val="2B9CE2"/>
-                  <w:sz w:val="14"/>
-                  <w:szCs w:val="14"/>
+                  <w:color w:val="0563C1"/>
                   <w:u w:val="single"/>
                 </w:rPr>
-                <w:t xml:space="preserve">Knowledge Hub</w:t>
+                <w:t xml:space="preserve">Knowledge Base</w:t>
               </w:r>
             </w:hyperlink>
           </w:p>
@@ -20962,16 +21228,13 @@
               <w:spacing w:after="0"/>
               <w:jc w:val="left"/>
             </w:pPr>
-            <w:hyperlink w:history="1" r:id="rIdgbwvzrhtcwmh9_g_8jkcq">
+            <w:hyperlink r:id="rId22">
               <w:r>
                 <w:rPr>
-                  <w:rFonts w:ascii="Arial" w:cs="Arial" w:eastAsia="Arial" w:hAnsi="Arial"/>
-                  <w:color w:val="2B9CE2"/>
-                  <w:sz w:val="14"/>
-                  <w:szCs w:val="14"/>
+                  <w:color w:val="0563C1"/>
                   <w:u w:val="single"/>
                 </w:rPr>
-                <w:t xml:space="preserve">Knowledge Hub</w:t>
+                <w:t xml:space="preserve">Knowledge Base</w:t>
               </w:r>
             </w:hyperlink>
           </w:p>
@@ -21305,13 +21568,10 @@
               <w:spacing w:after="0"/>
               <w:jc w:val="left"/>
             </w:pPr>
-            <w:hyperlink w:history="1" r:id="rIdk0fsrjczbk9pbzdiz1wls">
+            <w:hyperlink r:id="rId11">
               <w:r>
                 <w:rPr>
-                  <w:rFonts w:ascii="Arial" w:cs="Arial" w:eastAsia="Arial" w:hAnsi="Arial"/>
-                  <w:color w:val="2B9CE2"/>
-                  <w:sz w:val="14"/>
-                  <w:szCs w:val="14"/>
+                  <w:color w:val="0563C1"/>
                   <w:u w:val="single"/>
                 </w:rPr>
                 <w:t xml:space="preserve">CANTRAIN</w:t>
@@ -21933,6 +22193,1721 @@
       <w:tr>
         <w:tc>
           <w:tcPr>
+            <w:tcW w:type="dxa" w:w="4600"/>
+            <w:tcBorders>
+              <w:top w:val="single" w:color="E0DFE6" w:sz="1"/>
+              <w:left w:val="single" w:color="E0DFE6" w:sz="1"/>
+              <w:bottom w:val="single" w:color="E0DFE6" w:sz="1"/>
+              <w:right w:val="single" w:color="E0DFE6" w:sz="1"/>
+            </w:tcBorders>
+            <w:shd w:fill="F8F8F8" w:val="clear"/>
+            <w:tcMar>
+              <w:top w:type="dxa" w:w="50"/>
+              <w:left w:type="dxa" w:w="80"/>
+              <w:bottom w:type="dxa" w:w="50"/>
+              <w:right w:type="dxa" w:w="80"/>
+            </w:tcMar>
+            <w:vAlign w:val="top"/>
+          </w:tcPr>
+          <w:p>
+            <w:pPr>
+              <w:spacing w:after="0"/>
+              <w:jc w:val="left"/>
+            </w:pPr>
+            <w:r>
+              <w:rPr>
+                <w:rFonts w:ascii="Arial" w:cs="Arial" w:eastAsia="Arial" w:hAnsi="Arial"/>
+                <w:b w:val="false"/>
+                <w:bCs w:val="false"/>
+                <w:i/>
+                <w:iCs/>
+                <w:color w:val="474650"/>
+                <w:sz w:val="14"/>
+                <w:szCs w:val="14"/>
+              </w:rPr>
+              <w:t xml:space="preserve">Read: The Investigator Site File</w:t>
+            </w:r>
+          </w:p>
+        </w:tc>
+        <w:tc>
+          <w:tcPr>
+            <w:tcW w:type="dxa" w:w="2200"/>
+            <w:tcBorders>
+              <w:top w:val="single" w:color="E0DFE6" w:sz="1"/>
+              <w:left w:val="single" w:color="E0DFE6" w:sz="1"/>
+              <w:bottom w:val="single" w:color="E0DFE6" w:sz="1"/>
+              <w:right w:val="single" w:color="E0DFE6" w:sz="1"/>
+            </w:tcBorders>
+            <w:shd w:fill="F8F8F8" w:val="clear"/>
+            <w:tcMar>
+              <w:top w:type="dxa" w:w="50"/>
+              <w:left w:type="dxa" w:w="80"/>
+              <w:bottom w:type="dxa" w:w="50"/>
+              <w:right w:type="dxa" w:w="80"/>
+            </w:tcMar>
+            <w:vAlign w:val="top"/>
+          </w:tcPr>
+          <w:p>
+            <w:pPr>
+              <w:spacing w:after="0"/>
+              <w:jc w:val="left"/>
+            </w:pPr>
+            <w:hyperlink r:id="rId25">
+              <w:r>
+                <w:rPr>
+                  <w:color w:val="0563C1"/>
+                  <w:u w:val="single"/>
+                  <w:sz w:val="14"/>
+                  <w:szCs w:val="14"/>
+                  <w:rFonts w:ascii="Arial" w:hAnsi="Arial"/>
+                </w:rPr>
+                <w:t xml:space="preserve">Knowledge Base</w:t>
+              </w:r>
+            </w:hyperlink>
+          </w:p>
+        </w:tc>
+        <w:tc>
+          <w:tcPr>
+            <w:tcW w:type="dxa" w:w="1200"/>
+            <w:tcBorders>
+              <w:top w:val="single" w:color="E0DFE6" w:sz="1"/>
+              <w:left w:val="single" w:color="E0DFE6" w:sz="1"/>
+              <w:bottom w:val="single" w:color="E0DFE6" w:sz="1"/>
+              <w:right w:val="single" w:color="E0DFE6" w:sz="1"/>
+            </w:tcBorders>
+            <w:shd w:fill="F8F8F8" w:val="clear"/>
+            <w:tcMar>
+              <w:top w:type="dxa" w:w="50"/>
+              <w:left w:type="dxa" w:w="80"/>
+              <w:bottom w:type="dxa" w:w="50"/>
+              <w:right w:type="dxa" w:w="80"/>
+            </w:tcMar>
+            <w:vAlign w:val="top"/>
+          </w:tcPr>
+          <w:p>
+            <w:pPr>
+              <w:spacing w:after="0"/>
+              <w:jc w:val="center"/>
+            </w:pPr>
+            <w:r>
+              <w:rPr>
+                <w:rFonts w:ascii="Arial" w:cs="Arial" w:eastAsia="Arial" w:hAnsi="Arial"/>
+                <w:b w:val="false"/>
+                <w:bCs w:val="false"/>
+                <w:i w:val="false"/>
+                <w:iCs w:val="false"/>
+                <w:color w:val="474650"/>
+                <w:sz w:val="14"/>
+                <w:szCs w:val="14"/>
+              </w:rPr>
+              <w:t xml:space="preserve">Self-study</w:t>
+            </w:r>
+          </w:p>
+        </w:tc>
+        <w:tc>
+          <w:tcPr>
+            <w:tcW w:type="dxa" w:w="800"/>
+            <w:tcBorders>
+              <w:top w:val="single" w:color="E0DFE6" w:sz="1"/>
+              <w:left w:val="single" w:color="E0DFE6" w:sz="1"/>
+              <w:bottom w:val="single" w:color="E0DFE6" w:sz="1"/>
+              <w:right w:val="single" w:color="E0DFE6" w:sz="1"/>
+            </w:tcBorders>
+            <w:shd w:fill="F8F8F8" w:val="clear"/>
+            <w:tcMar>
+              <w:top w:type="dxa" w:w="50"/>
+              <w:left w:type="dxa" w:w="80"/>
+              <w:bottom w:type="dxa" w:w="50"/>
+              <w:right w:type="dxa" w:w="80"/>
+            </w:tcMar>
+            <w:vAlign w:val="top"/>
+          </w:tcPr>
+          <w:p>
+            <w:pPr>
+              <w:spacing w:after="0"/>
+              <w:jc w:val="center"/>
+            </w:pPr>
+            <w:r>
+              <w:rPr>
+                <w:rFonts w:ascii="Arial" w:cs="Arial" w:eastAsia="Arial" w:hAnsi="Arial"/>
+                <w:b w:val="false"/>
+                <w:bCs w:val="false"/>
+                <w:i w:val="false"/>
+                <w:iCs w:val="false"/>
+                <w:color w:val="474650"/>
+                <w:sz w:val="14"/>
+                <w:szCs w:val="14"/>
+              </w:rPr>
+              <w:t xml:space="preserve">All</w:t>
+            </w:r>
+          </w:p>
+        </w:tc>
+        <w:tc>
+          <w:tcPr>
+            <w:tcW w:type="dxa" w:w="1100"/>
+            <w:tcBorders>
+              <w:top w:val="single" w:color="E0DFE6" w:sz="1"/>
+              <w:left w:val="single" w:color="E0DFE6" w:sz="1"/>
+              <w:bottom w:val="single" w:color="E0DFE6" w:sz="1"/>
+              <w:right w:val="single" w:color="E0DFE6" w:sz="1"/>
+            </w:tcBorders>
+            <w:shd w:fill="F8F8F8" w:val="clear"/>
+            <w:tcMar>
+              <w:top w:type="dxa" w:w="50"/>
+              <w:left w:type="dxa" w:w="80"/>
+              <w:bottom w:type="dxa" w:w="50"/>
+              <w:right w:type="dxa" w:w="80"/>
+            </w:tcMar>
+            <w:vAlign w:val="top"/>
+          </w:tcPr>
+          <w:p>
+            <w:pPr>
+              <w:spacing w:after="0"/>
+              <w:jc w:val="left"/>
+            </w:pPr>
+            <w:r>
+              <w:rPr>
+                <w:rFonts w:ascii="Arial" w:cs="Arial" w:eastAsia="Arial" w:hAnsi="Arial"/>
+                <w:b w:val="false"/>
+                <w:bCs w:val="false"/>
+                <w:i w:val="false"/>
+                <w:iCs w:val="false"/>
+                <w:color w:val="474650"/>
+                <w:sz w:val="14"/>
+                <w:szCs w:val="14"/>
+              </w:rPr>
+              <w:t xml:space="preserve"/>
+            </w:r>
+          </w:p>
+        </w:tc>
+        <w:tc>
+          <w:tcPr>
+            <w:tcW w:type="dxa" w:w="1100"/>
+            <w:tcBorders>
+              <w:top w:val="single" w:color="E0DFE6" w:sz="1"/>
+              <w:left w:val="single" w:color="E0DFE6" w:sz="1"/>
+              <w:bottom w:val="single" w:color="E0DFE6" w:sz="1"/>
+              <w:right w:val="single" w:color="E0DFE6" w:sz="1"/>
+            </w:tcBorders>
+            <w:shd w:fill="F8F8F8" w:val="clear"/>
+            <w:tcMar>
+              <w:top w:type="dxa" w:w="50"/>
+              <w:left w:type="dxa" w:w="80"/>
+              <w:bottom w:type="dxa" w:w="50"/>
+              <w:right w:type="dxa" w:w="80"/>
+            </w:tcMar>
+            <w:vAlign w:val="top"/>
+          </w:tcPr>
+          <w:p>
+            <w:pPr>
+              <w:spacing w:after="0"/>
+              <w:jc w:val="left"/>
+            </w:pPr>
+            <w:r>
+              <w:rPr>
+                <w:rFonts w:ascii="Arial" w:cs="Arial" w:eastAsia="Arial" w:hAnsi="Arial"/>
+                <w:b w:val="false"/>
+                <w:bCs w:val="false"/>
+                <w:i w:val="false"/>
+                <w:iCs w:val="false"/>
+                <w:color w:val="474650"/>
+                <w:sz w:val="14"/>
+                <w:szCs w:val="14"/>
+              </w:rPr>
+              <w:t xml:space="preserve"/>
+            </w:r>
+          </w:p>
+        </w:tc>
+        <w:tc>
+          <w:tcPr>
+            <w:tcW w:type="dxa" w:w="800"/>
+            <w:tcBorders>
+              <w:top w:val="single" w:color="E0DFE6" w:sz="1"/>
+              <w:left w:val="single" w:color="E0DFE6" w:sz="1"/>
+              <w:bottom w:val="single" w:color="E0DFE6" w:sz="1"/>
+              <w:right w:val="single" w:color="E0DFE6" w:sz="1"/>
+            </w:tcBorders>
+            <w:shd w:fill="F8F8F8" w:val="clear"/>
+            <w:tcMar>
+              <w:top w:type="dxa" w:w="50"/>
+              <w:left w:type="dxa" w:w="80"/>
+              <w:bottom w:type="dxa" w:w="50"/>
+              <w:right w:type="dxa" w:w="80"/>
+            </w:tcMar>
+            <w:vAlign w:val="top"/>
+          </w:tcPr>
+          <w:p>
+            <w:pPr>
+              <w:spacing w:after="0"/>
+              <w:jc w:val="center"/>
+            </w:pPr>
+            <w:r>
+              <w:rPr>
+                <w:rFonts w:ascii="Arial" w:cs="Arial" w:eastAsia="Arial" w:hAnsi="Arial"/>
+                <w:b w:val="false"/>
+                <w:bCs w:val="false"/>
+                <w:i w:val="false"/>
+                <w:iCs w:val="false"/>
+                <w:color w:val="474650"/>
+                <w:sz w:val="14"/>
+                <w:szCs w:val="14"/>
+              </w:rPr>
+              <w:t xml:space="preserve"/>
+            </w:r>
+          </w:p>
+        </w:tc>
+        <w:tc>
+          <w:tcPr>
+            <w:tcW w:type="dxa" w:w="800"/>
+            <w:tcBorders>
+              <w:top w:val="single" w:color="E0DFE6" w:sz="1"/>
+              <w:left w:val="single" w:color="E0DFE6" w:sz="1"/>
+              <w:bottom w:val="single" w:color="E0DFE6" w:sz="1"/>
+              <w:right w:val="single" w:color="E0DFE6" w:sz="1"/>
+            </w:tcBorders>
+            <w:shd w:fill="F8F8F8" w:val="clear"/>
+            <w:tcMar>
+              <w:top w:type="dxa" w:w="50"/>
+              <w:left w:type="dxa" w:w="80"/>
+              <w:bottom w:type="dxa" w:w="50"/>
+              <w:right w:type="dxa" w:w="80"/>
+            </w:tcMar>
+            <w:vAlign w:val="top"/>
+          </w:tcPr>
+          <w:p>
+            <w:pPr>
+              <w:spacing w:after="0"/>
+              <w:jc w:val="center"/>
+            </w:pPr>
+            <w:r>
+              <w:rPr>
+                <w:rFonts w:ascii="Arial" w:cs="Arial" w:eastAsia="Arial" w:hAnsi="Arial"/>
+                <w:b w:val="false"/>
+                <w:bCs w:val="false"/>
+                <w:i w:val="false"/>
+                <w:iCs w:val="false"/>
+                <w:color w:val="474650"/>
+                <w:sz w:val="14"/>
+                <w:szCs w:val="14"/>
+              </w:rPr>
+              <w:t xml:space="preserve"/>
+            </w:r>
+          </w:p>
+        </w:tc>
+        <w:tc>
+          <w:tcPr>
+            <w:tcW w:type="dxa" w:w="1080"/>
+            <w:tcBorders>
+              <w:top w:val="single" w:color="E0DFE6" w:sz="1"/>
+              <w:left w:val="single" w:color="E0DFE6" w:sz="1"/>
+              <w:bottom w:val="single" w:color="E0DFE6" w:sz="1"/>
+              <w:right w:val="single" w:color="E0DFE6" w:sz="1"/>
+            </w:tcBorders>
+            <w:shd w:fill="F8F8F8" w:val="clear"/>
+            <w:tcMar>
+              <w:top w:type="dxa" w:w="50"/>
+              <w:left w:type="dxa" w:w="80"/>
+              <w:bottom w:type="dxa" w:w="50"/>
+              <w:right w:type="dxa" w:w="80"/>
+            </w:tcMar>
+            <w:vAlign w:val="top"/>
+          </w:tcPr>
+          <w:p>
+            <w:pPr>
+              <w:spacing w:after="0"/>
+              <w:jc w:val="left"/>
+            </w:pPr>
+            <w:r>
+              <w:rPr>
+                <w:rFonts w:ascii="Arial" w:cs="Arial" w:eastAsia="Arial" w:hAnsi="Arial"/>
+                <w:b w:val="false"/>
+                <w:bCs w:val="false"/>
+                <w:i w:val="false"/>
+                <w:iCs w:val="false"/>
+                <w:color w:val="474650"/>
+                <w:sz w:val="14"/>
+                <w:szCs w:val="14"/>
+              </w:rPr>
+              <w:t xml:space="preserve"/>
+            </w:r>
+          </w:p>
+        </w:tc>
+      </w:tr>
+      <w:tr>
+        <w:tc>
+          <w:tcPr>
+            <w:tcW w:type="dxa" w:w="4600"/>
+            <w:tcBorders>
+              <w:top w:val="single" w:color="E0DFE6" w:sz="1"/>
+              <w:left w:val="single" w:color="E0DFE6" w:sz="1"/>
+              <w:bottom w:val="single" w:color="E0DFE6" w:sz="1"/>
+              <w:right w:val="single" w:color="E0DFE6" w:sz="1"/>
+            </w:tcBorders>
+            <w:shd w:fill="F8F8F8" w:val="clear"/>
+            <w:tcMar>
+              <w:top w:type="dxa" w:w="50"/>
+              <w:left w:type="dxa" w:w="80"/>
+              <w:bottom w:type="dxa" w:w="50"/>
+              <w:right w:type="dxa" w:w="80"/>
+            </w:tcMar>
+            <w:vAlign w:val="top"/>
+          </w:tcPr>
+          <w:p>
+            <w:pPr>
+              <w:spacing w:after="0"/>
+              <w:jc w:val="left"/>
+            </w:pPr>
+            <w:r>
+              <w:rPr>
+                <w:rFonts w:ascii="Arial" w:cs="Arial" w:eastAsia="Arial" w:hAnsi="Arial"/>
+                <w:b w:val="false"/>
+                <w:bCs w:val="false"/>
+                <w:i/>
+                <w:iCs/>
+                <w:color w:val="474650"/>
+                <w:sz w:val="14"/>
+                <w:szCs w:val="14"/>
+              </w:rPr>
+              <w:t xml:space="preserve">Read: Site Activation and Study Setup</w:t>
+            </w:r>
+          </w:p>
+        </w:tc>
+        <w:tc>
+          <w:tcPr>
+            <w:tcW w:type="dxa" w:w="2200"/>
+            <w:tcBorders>
+              <w:top w:val="single" w:color="E0DFE6" w:sz="1"/>
+              <w:left w:val="single" w:color="E0DFE6" w:sz="1"/>
+              <w:bottom w:val="single" w:color="E0DFE6" w:sz="1"/>
+              <w:right w:val="single" w:color="E0DFE6" w:sz="1"/>
+            </w:tcBorders>
+            <w:shd w:fill="F8F8F8" w:val="clear"/>
+            <w:tcMar>
+              <w:top w:type="dxa" w:w="50"/>
+              <w:left w:type="dxa" w:w="80"/>
+              <w:bottom w:type="dxa" w:w="50"/>
+              <w:right w:type="dxa" w:w="80"/>
+            </w:tcMar>
+            <w:vAlign w:val="top"/>
+          </w:tcPr>
+          <w:p>
+            <w:pPr>
+              <w:spacing w:after="0"/>
+              <w:jc w:val="left"/>
+            </w:pPr>
+            <w:hyperlink r:id="rId26">
+              <w:r>
+                <w:rPr>
+                  <w:color w:val="0563C1"/>
+                  <w:u w:val="single"/>
+                  <w:sz w:val="14"/>
+                  <w:szCs w:val="14"/>
+                  <w:rFonts w:ascii="Arial" w:hAnsi="Arial"/>
+                </w:rPr>
+                <w:t xml:space="preserve">Knowledge Base</w:t>
+              </w:r>
+            </w:hyperlink>
+          </w:p>
+        </w:tc>
+        <w:tc>
+          <w:tcPr>
+            <w:tcW w:type="dxa" w:w="1200"/>
+            <w:tcBorders>
+              <w:top w:val="single" w:color="E0DFE6" w:sz="1"/>
+              <w:left w:val="single" w:color="E0DFE6" w:sz="1"/>
+              <w:bottom w:val="single" w:color="E0DFE6" w:sz="1"/>
+              <w:right w:val="single" w:color="E0DFE6" w:sz="1"/>
+            </w:tcBorders>
+            <w:shd w:fill="F8F8F8" w:val="clear"/>
+            <w:tcMar>
+              <w:top w:type="dxa" w:w="50"/>
+              <w:left w:type="dxa" w:w="80"/>
+              <w:bottom w:type="dxa" w:w="50"/>
+              <w:right w:type="dxa" w:w="80"/>
+            </w:tcMar>
+            <w:vAlign w:val="top"/>
+          </w:tcPr>
+          <w:p>
+            <w:pPr>
+              <w:spacing w:after="0"/>
+              <w:jc w:val="center"/>
+            </w:pPr>
+            <w:r>
+              <w:rPr>
+                <w:rFonts w:ascii="Arial" w:cs="Arial" w:eastAsia="Arial" w:hAnsi="Arial"/>
+                <w:b w:val="false"/>
+                <w:bCs w:val="false"/>
+                <w:i w:val="false"/>
+                <w:iCs w:val="false"/>
+                <w:color w:val="474650"/>
+                <w:sz w:val="14"/>
+                <w:szCs w:val="14"/>
+              </w:rPr>
+              <w:t xml:space="preserve">Self-study</w:t>
+            </w:r>
+          </w:p>
+        </w:tc>
+        <w:tc>
+          <w:tcPr>
+            <w:tcW w:type="dxa" w:w="800"/>
+            <w:tcBorders>
+              <w:top w:val="single" w:color="E0DFE6" w:sz="1"/>
+              <w:left w:val="single" w:color="E0DFE6" w:sz="1"/>
+              <w:bottom w:val="single" w:color="E0DFE6" w:sz="1"/>
+              <w:right w:val="single" w:color="E0DFE6" w:sz="1"/>
+            </w:tcBorders>
+            <w:shd w:fill="F8F8F8" w:val="clear"/>
+            <w:tcMar>
+              <w:top w:type="dxa" w:w="50"/>
+              <w:left w:type="dxa" w:w="80"/>
+              <w:bottom w:type="dxa" w:w="50"/>
+              <w:right w:type="dxa" w:w="80"/>
+            </w:tcMar>
+            <w:vAlign w:val="top"/>
+          </w:tcPr>
+          <w:p>
+            <w:pPr>
+              <w:spacing w:after="0"/>
+              <w:jc w:val="center"/>
+            </w:pPr>
+            <w:r>
+              <w:rPr>
+                <w:rFonts w:ascii="Arial" w:cs="Arial" w:eastAsia="Arial" w:hAnsi="Arial"/>
+                <w:b w:val="false"/>
+                <w:bCs w:val="false"/>
+                <w:i w:val="false"/>
+                <w:iCs w:val="false"/>
+                <w:color w:val="474650"/>
+                <w:sz w:val="14"/>
+                <w:szCs w:val="14"/>
+              </w:rPr>
+              <w:t xml:space="preserve">All</w:t>
+            </w:r>
+          </w:p>
+        </w:tc>
+        <w:tc>
+          <w:tcPr>
+            <w:tcW w:type="dxa" w:w="1100"/>
+            <w:tcBorders>
+              <w:top w:val="single" w:color="E0DFE6" w:sz="1"/>
+              <w:left w:val="single" w:color="E0DFE6" w:sz="1"/>
+              <w:bottom w:val="single" w:color="E0DFE6" w:sz="1"/>
+              <w:right w:val="single" w:color="E0DFE6" w:sz="1"/>
+            </w:tcBorders>
+            <w:shd w:fill="F8F8F8" w:val="clear"/>
+            <w:tcMar>
+              <w:top w:type="dxa" w:w="50"/>
+              <w:left w:type="dxa" w:w="80"/>
+              <w:bottom w:type="dxa" w:w="50"/>
+              <w:right w:type="dxa" w:w="80"/>
+            </w:tcMar>
+            <w:vAlign w:val="top"/>
+          </w:tcPr>
+          <w:p>
+            <w:pPr>
+              <w:spacing w:after="0"/>
+              <w:jc w:val="left"/>
+            </w:pPr>
+            <w:r>
+              <w:rPr>
+                <w:rFonts w:ascii="Arial" w:cs="Arial" w:eastAsia="Arial" w:hAnsi="Arial"/>
+                <w:b w:val="false"/>
+                <w:bCs w:val="false"/>
+                <w:i w:val="false"/>
+                <w:iCs w:val="false"/>
+                <w:color w:val="474650"/>
+                <w:sz w:val="14"/>
+                <w:szCs w:val="14"/>
+              </w:rPr>
+              <w:t xml:space="preserve"/>
+            </w:r>
+          </w:p>
+        </w:tc>
+        <w:tc>
+          <w:tcPr>
+            <w:tcW w:type="dxa" w:w="1100"/>
+            <w:tcBorders>
+              <w:top w:val="single" w:color="E0DFE6" w:sz="1"/>
+              <w:left w:val="single" w:color="E0DFE6" w:sz="1"/>
+              <w:bottom w:val="single" w:color="E0DFE6" w:sz="1"/>
+              <w:right w:val="single" w:color="E0DFE6" w:sz="1"/>
+            </w:tcBorders>
+            <w:shd w:fill="F8F8F8" w:val="clear"/>
+            <w:tcMar>
+              <w:top w:type="dxa" w:w="50"/>
+              <w:left w:type="dxa" w:w="80"/>
+              <w:bottom w:type="dxa" w:w="50"/>
+              <w:right w:type="dxa" w:w="80"/>
+            </w:tcMar>
+            <w:vAlign w:val="top"/>
+          </w:tcPr>
+          <w:p>
+            <w:pPr>
+              <w:spacing w:after="0"/>
+              <w:jc w:val="left"/>
+            </w:pPr>
+            <w:r>
+              <w:rPr>
+                <w:rFonts w:ascii="Arial" w:cs="Arial" w:eastAsia="Arial" w:hAnsi="Arial"/>
+                <w:b w:val="false"/>
+                <w:bCs w:val="false"/>
+                <w:i w:val="false"/>
+                <w:iCs w:val="false"/>
+                <w:color w:val="474650"/>
+                <w:sz w:val="14"/>
+                <w:szCs w:val="14"/>
+              </w:rPr>
+              <w:t xml:space="preserve"/>
+            </w:r>
+          </w:p>
+        </w:tc>
+        <w:tc>
+          <w:tcPr>
+            <w:tcW w:type="dxa" w:w="800"/>
+            <w:tcBorders>
+              <w:top w:val="single" w:color="E0DFE6" w:sz="1"/>
+              <w:left w:val="single" w:color="E0DFE6" w:sz="1"/>
+              <w:bottom w:val="single" w:color="E0DFE6" w:sz="1"/>
+              <w:right w:val="single" w:color="E0DFE6" w:sz="1"/>
+            </w:tcBorders>
+            <w:shd w:fill="F8F8F8" w:val="clear"/>
+            <w:tcMar>
+              <w:top w:type="dxa" w:w="50"/>
+              <w:left w:type="dxa" w:w="80"/>
+              <w:bottom w:type="dxa" w:w="50"/>
+              <w:right w:type="dxa" w:w="80"/>
+            </w:tcMar>
+            <w:vAlign w:val="top"/>
+          </w:tcPr>
+          <w:p>
+            <w:pPr>
+              <w:spacing w:after="0"/>
+              <w:jc w:val="center"/>
+            </w:pPr>
+            <w:r>
+              <w:rPr>
+                <w:rFonts w:ascii="Arial" w:cs="Arial" w:eastAsia="Arial" w:hAnsi="Arial"/>
+                <w:b w:val="false"/>
+                <w:bCs w:val="false"/>
+                <w:i w:val="false"/>
+                <w:iCs w:val="false"/>
+                <w:color w:val="474650"/>
+                <w:sz w:val="14"/>
+                <w:szCs w:val="14"/>
+              </w:rPr>
+              <w:t xml:space="preserve"/>
+            </w:r>
+          </w:p>
+        </w:tc>
+        <w:tc>
+          <w:tcPr>
+            <w:tcW w:type="dxa" w:w="800"/>
+            <w:tcBorders>
+              <w:top w:val="single" w:color="E0DFE6" w:sz="1"/>
+              <w:left w:val="single" w:color="E0DFE6" w:sz="1"/>
+              <w:bottom w:val="single" w:color="E0DFE6" w:sz="1"/>
+              <w:right w:val="single" w:color="E0DFE6" w:sz="1"/>
+            </w:tcBorders>
+            <w:shd w:fill="F8F8F8" w:val="clear"/>
+            <w:tcMar>
+              <w:top w:type="dxa" w:w="50"/>
+              <w:left w:type="dxa" w:w="80"/>
+              <w:bottom w:type="dxa" w:w="50"/>
+              <w:right w:type="dxa" w:w="80"/>
+            </w:tcMar>
+            <w:vAlign w:val="top"/>
+          </w:tcPr>
+          <w:p>
+            <w:pPr>
+              <w:spacing w:after="0"/>
+              <w:jc w:val="center"/>
+            </w:pPr>
+            <w:r>
+              <w:rPr>
+                <w:rFonts w:ascii="Arial" w:cs="Arial" w:eastAsia="Arial" w:hAnsi="Arial"/>
+                <w:b w:val="false"/>
+                <w:bCs w:val="false"/>
+                <w:i w:val="false"/>
+                <w:iCs w:val="false"/>
+                <w:color w:val="474650"/>
+                <w:sz w:val="14"/>
+                <w:szCs w:val="14"/>
+              </w:rPr>
+              <w:t xml:space="preserve"/>
+            </w:r>
+          </w:p>
+        </w:tc>
+        <w:tc>
+          <w:tcPr>
+            <w:tcW w:type="dxa" w:w="1080"/>
+            <w:tcBorders>
+              <w:top w:val="single" w:color="E0DFE6" w:sz="1"/>
+              <w:left w:val="single" w:color="E0DFE6" w:sz="1"/>
+              <w:bottom w:val="single" w:color="E0DFE6" w:sz="1"/>
+              <w:right w:val="single" w:color="E0DFE6" w:sz="1"/>
+            </w:tcBorders>
+            <w:shd w:fill="F8F8F8" w:val="clear"/>
+            <w:tcMar>
+              <w:top w:type="dxa" w:w="50"/>
+              <w:left w:type="dxa" w:w="80"/>
+              <w:bottom w:type="dxa" w:w="50"/>
+              <w:right w:type="dxa" w:w="80"/>
+            </w:tcMar>
+            <w:vAlign w:val="top"/>
+          </w:tcPr>
+          <w:p>
+            <w:pPr>
+              <w:spacing w:after="0"/>
+              <w:jc w:val="left"/>
+            </w:pPr>
+            <w:r>
+              <w:rPr>
+                <w:rFonts w:ascii="Arial" w:cs="Arial" w:eastAsia="Arial" w:hAnsi="Arial"/>
+                <w:b w:val="false"/>
+                <w:bCs w:val="false"/>
+                <w:i w:val="false"/>
+                <w:iCs w:val="false"/>
+                <w:color w:val="474650"/>
+                <w:sz w:val="14"/>
+                <w:szCs w:val="14"/>
+              </w:rPr>
+              <w:t xml:space="preserve"/>
+            </w:r>
+          </w:p>
+        </w:tc>
+      </w:tr>
+      <w:tr>
+        <w:tc>
+          <w:tcPr>
+            <w:tcW w:type="dxa" w:w="4600"/>
+            <w:tcBorders>
+              <w:top w:val="single" w:color="E0DFE6" w:sz="1"/>
+              <w:left w:val="single" w:color="E0DFE6" w:sz="1"/>
+              <w:bottom w:val="single" w:color="E0DFE6" w:sz="1"/>
+              <w:right w:val="single" w:color="E0DFE6" w:sz="1"/>
+            </w:tcBorders>
+            <w:shd w:fill="F8F8F8" w:val="clear"/>
+            <w:tcMar>
+              <w:top w:type="dxa" w:w="50"/>
+              <w:left w:type="dxa" w:w="80"/>
+              <w:bottom w:type="dxa" w:w="50"/>
+              <w:right w:type="dxa" w:w="80"/>
+            </w:tcMar>
+            <w:vAlign w:val="top"/>
+          </w:tcPr>
+          <w:p>
+            <w:pPr>
+              <w:spacing w:after="0"/>
+              <w:jc w:val="left"/>
+            </w:pPr>
+            <w:r>
+              <w:rPr>
+                <w:rFonts w:ascii="Arial" w:cs="Arial" w:eastAsia="Arial" w:hAnsi="Arial"/>
+                <w:b w:val="false"/>
+                <w:bCs w:val="false"/>
+                <w:i/>
+                <w:iCs/>
+                <w:color w:val="474650"/>
+                <w:sz w:val="14"/>
+                <w:szCs w:val="14"/>
+              </w:rPr>
+              <w:t xml:space="preserve">Read: Preparing Your Submission</w:t>
+            </w:r>
+          </w:p>
+        </w:tc>
+        <w:tc>
+          <w:tcPr>
+            <w:tcW w:type="dxa" w:w="2200"/>
+            <w:tcBorders>
+              <w:top w:val="single" w:color="E0DFE6" w:sz="1"/>
+              <w:left w:val="single" w:color="E0DFE6" w:sz="1"/>
+              <w:bottom w:val="single" w:color="E0DFE6" w:sz="1"/>
+              <w:right w:val="single" w:color="E0DFE6" w:sz="1"/>
+            </w:tcBorders>
+            <w:shd w:fill="F8F8F8" w:val="clear"/>
+            <w:tcMar>
+              <w:top w:type="dxa" w:w="50"/>
+              <w:left w:type="dxa" w:w="80"/>
+              <w:bottom w:type="dxa" w:w="50"/>
+              <w:right w:type="dxa" w:w="80"/>
+            </w:tcMar>
+            <w:vAlign w:val="top"/>
+          </w:tcPr>
+          <w:p>
+            <w:pPr>
+              <w:spacing w:after="0"/>
+              <w:jc w:val="left"/>
+            </w:pPr>
+            <w:hyperlink r:id="rId27">
+              <w:r>
+                <w:rPr>
+                  <w:color w:val="0563C1"/>
+                  <w:u w:val="single"/>
+                  <w:sz w:val="14"/>
+                  <w:szCs w:val="14"/>
+                  <w:rFonts w:ascii="Arial" w:hAnsi="Arial"/>
+                </w:rPr>
+                <w:t xml:space="preserve">Knowledge Base</w:t>
+              </w:r>
+            </w:hyperlink>
+          </w:p>
+        </w:tc>
+        <w:tc>
+          <w:tcPr>
+            <w:tcW w:type="dxa" w:w="1200"/>
+            <w:tcBorders>
+              <w:top w:val="single" w:color="E0DFE6" w:sz="1"/>
+              <w:left w:val="single" w:color="E0DFE6" w:sz="1"/>
+              <w:bottom w:val="single" w:color="E0DFE6" w:sz="1"/>
+              <w:right w:val="single" w:color="E0DFE6" w:sz="1"/>
+            </w:tcBorders>
+            <w:shd w:fill="F8F8F8" w:val="clear"/>
+            <w:tcMar>
+              <w:top w:type="dxa" w:w="50"/>
+              <w:left w:type="dxa" w:w="80"/>
+              <w:bottom w:type="dxa" w:w="50"/>
+              <w:right w:type="dxa" w:w="80"/>
+            </w:tcMar>
+            <w:vAlign w:val="top"/>
+          </w:tcPr>
+          <w:p>
+            <w:pPr>
+              <w:spacing w:after="0"/>
+              <w:jc w:val="center"/>
+            </w:pPr>
+            <w:r>
+              <w:rPr>
+                <w:rFonts w:ascii="Arial" w:cs="Arial" w:eastAsia="Arial" w:hAnsi="Arial"/>
+                <w:b w:val="false"/>
+                <w:bCs w:val="false"/>
+                <w:i w:val="false"/>
+                <w:iCs w:val="false"/>
+                <w:color w:val="474650"/>
+                <w:sz w:val="14"/>
+                <w:szCs w:val="14"/>
+              </w:rPr>
+              <w:t xml:space="preserve">Self-study</w:t>
+            </w:r>
+          </w:p>
+        </w:tc>
+        <w:tc>
+          <w:tcPr>
+            <w:tcW w:type="dxa" w:w="800"/>
+            <w:tcBorders>
+              <w:top w:val="single" w:color="E0DFE6" w:sz="1"/>
+              <w:left w:val="single" w:color="E0DFE6" w:sz="1"/>
+              <w:bottom w:val="single" w:color="E0DFE6" w:sz="1"/>
+              <w:right w:val="single" w:color="E0DFE6" w:sz="1"/>
+            </w:tcBorders>
+            <w:shd w:fill="F8F8F8" w:val="clear"/>
+            <w:tcMar>
+              <w:top w:type="dxa" w:w="50"/>
+              <w:left w:type="dxa" w:w="80"/>
+              <w:bottom w:type="dxa" w:w="50"/>
+              <w:right w:type="dxa" w:w="80"/>
+            </w:tcMar>
+            <w:vAlign w:val="top"/>
+          </w:tcPr>
+          <w:p>
+            <w:pPr>
+              <w:spacing w:after="0"/>
+              <w:jc w:val="center"/>
+            </w:pPr>
+            <w:r>
+              <w:rPr>
+                <w:rFonts w:ascii="Arial" w:cs="Arial" w:eastAsia="Arial" w:hAnsi="Arial"/>
+                <w:b w:val="false"/>
+                <w:bCs w:val="false"/>
+                <w:i w:val="false"/>
+                <w:iCs w:val="false"/>
+                <w:color w:val="474650"/>
+                <w:sz w:val="14"/>
+                <w:szCs w:val="14"/>
+              </w:rPr>
+              <w:t xml:space="preserve">All</w:t>
+            </w:r>
+          </w:p>
+        </w:tc>
+        <w:tc>
+          <w:tcPr>
+            <w:tcW w:type="dxa" w:w="1100"/>
+            <w:tcBorders>
+              <w:top w:val="single" w:color="E0DFE6" w:sz="1"/>
+              <w:left w:val="single" w:color="E0DFE6" w:sz="1"/>
+              <w:bottom w:val="single" w:color="E0DFE6" w:sz="1"/>
+              <w:right w:val="single" w:color="E0DFE6" w:sz="1"/>
+            </w:tcBorders>
+            <w:shd w:fill="F8F8F8" w:val="clear"/>
+            <w:tcMar>
+              <w:top w:type="dxa" w:w="50"/>
+              <w:left w:type="dxa" w:w="80"/>
+              <w:bottom w:type="dxa" w:w="50"/>
+              <w:right w:type="dxa" w:w="80"/>
+            </w:tcMar>
+            <w:vAlign w:val="top"/>
+          </w:tcPr>
+          <w:p>
+            <w:pPr>
+              <w:spacing w:after="0"/>
+              <w:jc w:val="left"/>
+            </w:pPr>
+            <w:r>
+              <w:rPr>
+                <w:rFonts w:ascii="Arial" w:cs="Arial" w:eastAsia="Arial" w:hAnsi="Arial"/>
+                <w:b w:val="false"/>
+                <w:bCs w:val="false"/>
+                <w:i w:val="false"/>
+                <w:iCs w:val="false"/>
+                <w:color w:val="474650"/>
+                <w:sz w:val="14"/>
+                <w:szCs w:val="14"/>
+              </w:rPr>
+              <w:t xml:space="preserve"/>
+            </w:r>
+          </w:p>
+        </w:tc>
+        <w:tc>
+          <w:tcPr>
+            <w:tcW w:type="dxa" w:w="1100"/>
+            <w:tcBorders>
+              <w:top w:val="single" w:color="E0DFE6" w:sz="1"/>
+              <w:left w:val="single" w:color="E0DFE6" w:sz="1"/>
+              <w:bottom w:val="single" w:color="E0DFE6" w:sz="1"/>
+              <w:right w:val="single" w:color="E0DFE6" w:sz="1"/>
+            </w:tcBorders>
+            <w:shd w:fill="F8F8F8" w:val="clear"/>
+            <w:tcMar>
+              <w:top w:type="dxa" w:w="50"/>
+              <w:left w:type="dxa" w:w="80"/>
+              <w:bottom w:type="dxa" w:w="50"/>
+              <w:right w:type="dxa" w:w="80"/>
+            </w:tcMar>
+            <w:vAlign w:val="top"/>
+          </w:tcPr>
+          <w:p>
+            <w:pPr>
+              <w:spacing w:after="0"/>
+              <w:jc w:val="left"/>
+            </w:pPr>
+            <w:r>
+              <w:rPr>
+                <w:rFonts w:ascii="Arial" w:cs="Arial" w:eastAsia="Arial" w:hAnsi="Arial"/>
+                <w:b w:val="false"/>
+                <w:bCs w:val="false"/>
+                <w:i w:val="false"/>
+                <w:iCs w:val="false"/>
+                <w:color w:val="474650"/>
+                <w:sz w:val="14"/>
+                <w:szCs w:val="14"/>
+              </w:rPr>
+              <w:t xml:space="preserve"/>
+            </w:r>
+          </w:p>
+        </w:tc>
+        <w:tc>
+          <w:tcPr>
+            <w:tcW w:type="dxa" w:w="800"/>
+            <w:tcBorders>
+              <w:top w:val="single" w:color="E0DFE6" w:sz="1"/>
+              <w:left w:val="single" w:color="E0DFE6" w:sz="1"/>
+              <w:bottom w:val="single" w:color="E0DFE6" w:sz="1"/>
+              <w:right w:val="single" w:color="E0DFE6" w:sz="1"/>
+            </w:tcBorders>
+            <w:shd w:fill="F8F8F8" w:val="clear"/>
+            <w:tcMar>
+              <w:top w:type="dxa" w:w="50"/>
+              <w:left w:type="dxa" w:w="80"/>
+              <w:bottom w:type="dxa" w:w="50"/>
+              <w:right w:type="dxa" w:w="80"/>
+            </w:tcMar>
+            <w:vAlign w:val="top"/>
+          </w:tcPr>
+          <w:p>
+            <w:pPr>
+              <w:spacing w:after="0"/>
+              <w:jc w:val="center"/>
+            </w:pPr>
+            <w:r>
+              <w:rPr>
+                <w:rFonts w:ascii="Arial" w:cs="Arial" w:eastAsia="Arial" w:hAnsi="Arial"/>
+                <w:b w:val="false"/>
+                <w:bCs w:val="false"/>
+                <w:i w:val="false"/>
+                <w:iCs w:val="false"/>
+                <w:color w:val="474650"/>
+                <w:sz w:val="14"/>
+                <w:szCs w:val="14"/>
+              </w:rPr>
+              <w:t xml:space="preserve"/>
+            </w:r>
+          </w:p>
+        </w:tc>
+        <w:tc>
+          <w:tcPr>
+            <w:tcW w:type="dxa" w:w="800"/>
+            <w:tcBorders>
+              <w:top w:val="single" w:color="E0DFE6" w:sz="1"/>
+              <w:left w:val="single" w:color="E0DFE6" w:sz="1"/>
+              <w:bottom w:val="single" w:color="E0DFE6" w:sz="1"/>
+              <w:right w:val="single" w:color="E0DFE6" w:sz="1"/>
+            </w:tcBorders>
+            <w:shd w:fill="F8F8F8" w:val="clear"/>
+            <w:tcMar>
+              <w:top w:type="dxa" w:w="50"/>
+              <w:left w:type="dxa" w:w="80"/>
+              <w:bottom w:type="dxa" w:w="50"/>
+              <w:right w:type="dxa" w:w="80"/>
+            </w:tcMar>
+            <w:vAlign w:val="top"/>
+          </w:tcPr>
+          <w:p>
+            <w:pPr>
+              <w:spacing w:after="0"/>
+              <w:jc w:val="center"/>
+            </w:pPr>
+            <w:r>
+              <w:rPr>
+                <w:rFonts w:ascii="Arial" w:cs="Arial" w:eastAsia="Arial" w:hAnsi="Arial"/>
+                <w:b w:val="false"/>
+                <w:bCs w:val="false"/>
+                <w:i w:val="false"/>
+                <w:iCs w:val="false"/>
+                <w:color w:val="474650"/>
+                <w:sz w:val="14"/>
+                <w:szCs w:val="14"/>
+              </w:rPr>
+              <w:t xml:space="preserve"/>
+            </w:r>
+          </w:p>
+        </w:tc>
+        <w:tc>
+          <w:tcPr>
+            <w:tcW w:type="dxa" w:w="1080"/>
+            <w:tcBorders>
+              <w:top w:val="single" w:color="E0DFE6" w:sz="1"/>
+              <w:left w:val="single" w:color="E0DFE6" w:sz="1"/>
+              <w:bottom w:val="single" w:color="E0DFE6" w:sz="1"/>
+              <w:right w:val="single" w:color="E0DFE6" w:sz="1"/>
+            </w:tcBorders>
+            <w:shd w:fill="F8F8F8" w:val="clear"/>
+            <w:tcMar>
+              <w:top w:type="dxa" w:w="50"/>
+              <w:left w:type="dxa" w:w="80"/>
+              <w:bottom w:type="dxa" w:w="50"/>
+              <w:right w:type="dxa" w:w="80"/>
+            </w:tcMar>
+            <w:vAlign w:val="top"/>
+          </w:tcPr>
+          <w:p>
+            <w:pPr>
+              <w:spacing w:after="0"/>
+              <w:jc w:val="left"/>
+            </w:pPr>
+            <w:r>
+              <w:rPr>
+                <w:rFonts w:ascii="Arial" w:cs="Arial" w:eastAsia="Arial" w:hAnsi="Arial"/>
+                <w:b w:val="false"/>
+                <w:bCs w:val="false"/>
+                <w:i w:val="false"/>
+                <w:iCs w:val="false"/>
+                <w:color w:val="474650"/>
+                <w:sz w:val="14"/>
+                <w:szCs w:val="14"/>
+              </w:rPr>
+              <w:t xml:space="preserve"/>
+            </w:r>
+          </w:p>
+        </w:tc>
+      </w:tr>
+      <w:tr>
+        <w:tc>
+          <w:tcPr>
+            <w:tcW w:type="dxa" w:w="4600"/>
+            <w:tcBorders>
+              <w:top w:val="single" w:color="E0DFE6" w:sz="1"/>
+              <w:left w:val="single" w:color="E0DFE6" w:sz="1"/>
+              <w:bottom w:val="single" w:color="E0DFE6" w:sz="1"/>
+              <w:right w:val="single" w:color="E0DFE6" w:sz="1"/>
+            </w:tcBorders>
+            <w:shd w:fill="F8F8F8" w:val="clear"/>
+            <w:tcMar>
+              <w:top w:type="dxa" w:w="50"/>
+              <w:left w:type="dxa" w:w="80"/>
+              <w:bottom w:type="dxa" w:w="50"/>
+              <w:right w:type="dxa" w:w="80"/>
+            </w:tcMar>
+            <w:vAlign w:val="top"/>
+          </w:tcPr>
+          <w:p>
+            <w:pPr>
+              <w:spacing w:after="0"/>
+              <w:jc w:val="left"/>
+            </w:pPr>
+            <w:r>
+              <w:rPr>
+                <w:rFonts w:ascii="Arial" w:cs="Arial" w:eastAsia="Arial" w:hAnsi="Arial"/>
+                <w:b w:val="false"/>
+                <w:bCs w:val="false"/>
+                <w:i/>
+                <w:iCs/>
+                <w:color w:val="474650"/>
+                <w:sz w:val="14"/>
+                <w:szCs w:val="14"/>
+              </w:rPr>
+              <w:t xml:space="preserve">Review: Nagano submission workflow for your study</w:t>
+            </w:r>
+          </w:p>
+        </w:tc>
+        <w:tc>
+          <w:tcPr>
+            <w:tcW w:type="dxa" w:w="2200"/>
+            <w:tcBorders>
+              <w:top w:val="single" w:color="E0DFE6" w:sz="1"/>
+              <w:left w:val="single" w:color="E0DFE6" w:sz="1"/>
+              <w:bottom w:val="single" w:color="E0DFE6" w:sz="1"/>
+              <w:right w:val="single" w:color="E0DFE6" w:sz="1"/>
+            </w:tcBorders>
+            <w:shd w:fill="F8F8F8" w:val="clear"/>
+            <w:tcMar>
+              <w:top w:type="dxa" w:w="50"/>
+              <w:left w:type="dxa" w:w="80"/>
+              <w:bottom w:type="dxa" w:w="50"/>
+              <w:right w:type="dxa" w:w="80"/>
+            </w:tcMar>
+            <w:vAlign w:val="top"/>
+          </w:tcPr>
+          <w:p>
+            <w:pPr>
+              <w:spacing w:after="0"/>
+              <w:jc w:val="left"/>
+            </w:pPr>
+            <w:hyperlink r:id="rId14">
+              <w:r>
+                <w:rPr>
+                  <w:color w:val="0563C1"/>
+                  <w:u w:val="single"/>
+                  <w:sz w:val="14"/>
+                  <w:szCs w:val="14"/>
+                  <w:rFonts w:ascii="Arial" w:hAnsi="Arial"/>
+                </w:rPr>
+                <w:t xml:space="preserve">Nagano Guide</w:t>
+              </w:r>
+            </w:hyperlink>
+          </w:p>
+        </w:tc>
+        <w:tc>
+          <w:tcPr>
+            <w:tcW w:type="dxa" w:w="1200"/>
+            <w:tcBorders>
+              <w:top w:val="single" w:color="E0DFE6" w:sz="1"/>
+              <w:left w:val="single" w:color="E0DFE6" w:sz="1"/>
+              <w:bottom w:val="single" w:color="E0DFE6" w:sz="1"/>
+              <w:right w:val="single" w:color="E0DFE6" w:sz="1"/>
+            </w:tcBorders>
+            <w:shd w:fill="F8F8F8" w:val="clear"/>
+            <w:tcMar>
+              <w:top w:type="dxa" w:w="50"/>
+              <w:left w:type="dxa" w:w="80"/>
+              <w:bottom w:type="dxa" w:w="50"/>
+              <w:right w:type="dxa" w:w="80"/>
+            </w:tcMar>
+            <w:vAlign w:val="top"/>
+          </w:tcPr>
+          <w:p>
+            <w:pPr>
+              <w:spacing w:after="0"/>
+              <w:jc w:val="center"/>
+            </w:pPr>
+            <w:r>
+              <w:rPr>
+                <w:rFonts w:ascii="Arial" w:cs="Arial" w:eastAsia="Arial" w:hAnsi="Arial"/>
+                <w:b w:val="false"/>
+                <w:bCs w:val="false"/>
+                <w:i w:val="false"/>
+                <w:iCs w:val="false"/>
+                <w:color w:val="474650"/>
+                <w:sz w:val="14"/>
+                <w:szCs w:val="14"/>
+              </w:rPr>
+              <w:t xml:space="preserve">Discussion</w:t>
+            </w:r>
+          </w:p>
+        </w:tc>
+        <w:tc>
+          <w:tcPr>
+            <w:tcW w:type="dxa" w:w="800"/>
+            <w:tcBorders>
+              <w:top w:val="single" w:color="E0DFE6" w:sz="1"/>
+              <w:left w:val="single" w:color="E0DFE6" w:sz="1"/>
+              <w:bottom w:val="single" w:color="E0DFE6" w:sz="1"/>
+              <w:right w:val="single" w:color="E0DFE6" w:sz="1"/>
+            </w:tcBorders>
+            <w:shd w:fill="F8F8F8" w:val="clear"/>
+            <w:tcMar>
+              <w:top w:type="dxa" w:w="50"/>
+              <w:left w:type="dxa" w:w="80"/>
+              <w:bottom w:type="dxa" w:w="50"/>
+              <w:right w:type="dxa" w:w="80"/>
+            </w:tcMar>
+            <w:vAlign w:val="top"/>
+          </w:tcPr>
+          <w:p>
+            <w:pPr>
+              <w:spacing w:after="0"/>
+              <w:jc w:val="center"/>
+            </w:pPr>
+            <w:r>
+              <w:rPr>
+                <w:rFonts w:ascii="Arial" w:cs="Arial" w:eastAsia="Arial" w:hAnsi="Arial"/>
+                <w:b w:val="false"/>
+                <w:bCs w:val="false"/>
+                <w:i w:val="false"/>
+                <w:iCs w:val="false"/>
+                <w:color w:val="474650"/>
+                <w:sz w:val="14"/>
+                <w:szCs w:val="14"/>
+              </w:rPr>
+              <w:t xml:space="preserve">All</w:t>
+            </w:r>
+          </w:p>
+        </w:tc>
+        <w:tc>
+          <w:tcPr>
+            <w:tcW w:type="dxa" w:w="1100"/>
+            <w:tcBorders>
+              <w:top w:val="single" w:color="E0DFE6" w:sz="1"/>
+              <w:left w:val="single" w:color="E0DFE6" w:sz="1"/>
+              <w:bottom w:val="single" w:color="E0DFE6" w:sz="1"/>
+              <w:right w:val="single" w:color="E0DFE6" w:sz="1"/>
+            </w:tcBorders>
+            <w:shd w:fill="F8F8F8" w:val="clear"/>
+            <w:tcMar>
+              <w:top w:type="dxa" w:w="50"/>
+              <w:left w:type="dxa" w:w="80"/>
+              <w:bottom w:type="dxa" w:w="50"/>
+              <w:right w:type="dxa" w:w="80"/>
+            </w:tcMar>
+            <w:vAlign w:val="top"/>
+          </w:tcPr>
+          <w:p>
+            <w:pPr>
+              <w:spacing w:after="0"/>
+              <w:jc w:val="left"/>
+            </w:pPr>
+            <w:r>
+              <w:rPr>
+                <w:rFonts w:ascii="Arial" w:cs="Arial" w:eastAsia="Arial" w:hAnsi="Arial"/>
+                <w:b w:val="false"/>
+                <w:bCs w:val="false"/>
+                <w:i w:val="false"/>
+                <w:iCs w:val="false"/>
+                <w:color w:val="474650"/>
+                <w:sz w:val="14"/>
+                <w:szCs w:val="14"/>
+              </w:rPr>
+              <w:t xml:space="preserve"/>
+            </w:r>
+          </w:p>
+        </w:tc>
+        <w:tc>
+          <w:tcPr>
+            <w:tcW w:type="dxa" w:w="1100"/>
+            <w:tcBorders>
+              <w:top w:val="single" w:color="E0DFE6" w:sz="1"/>
+              <w:left w:val="single" w:color="E0DFE6" w:sz="1"/>
+              <w:bottom w:val="single" w:color="E0DFE6" w:sz="1"/>
+              <w:right w:val="single" w:color="E0DFE6" w:sz="1"/>
+            </w:tcBorders>
+            <w:shd w:fill="F8F8F8" w:val="clear"/>
+            <w:tcMar>
+              <w:top w:type="dxa" w:w="50"/>
+              <w:left w:type="dxa" w:w="80"/>
+              <w:bottom w:type="dxa" w:w="50"/>
+              <w:right w:type="dxa" w:w="80"/>
+            </w:tcMar>
+            <w:vAlign w:val="top"/>
+          </w:tcPr>
+          <w:p>
+            <w:pPr>
+              <w:spacing w:after="0"/>
+              <w:jc w:val="left"/>
+            </w:pPr>
+            <w:r>
+              <w:rPr>
+                <w:rFonts w:ascii="Arial" w:cs="Arial" w:eastAsia="Arial" w:hAnsi="Arial"/>
+                <w:b w:val="false"/>
+                <w:bCs w:val="false"/>
+                <w:i w:val="false"/>
+                <w:iCs w:val="false"/>
+                <w:color w:val="474650"/>
+                <w:sz w:val="14"/>
+                <w:szCs w:val="14"/>
+              </w:rPr>
+              <w:t xml:space="preserve"/>
+            </w:r>
+          </w:p>
+        </w:tc>
+        <w:tc>
+          <w:tcPr>
+            <w:tcW w:type="dxa" w:w="800"/>
+            <w:tcBorders>
+              <w:top w:val="single" w:color="E0DFE6" w:sz="1"/>
+              <w:left w:val="single" w:color="E0DFE6" w:sz="1"/>
+              <w:bottom w:val="single" w:color="E0DFE6" w:sz="1"/>
+              <w:right w:val="single" w:color="E0DFE6" w:sz="1"/>
+            </w:tcBorders>
+            <w:shd w:fill="F8F8F8" w:val="clear"/>
+            <w:tcMar>
+              <w:top w:type="dxa" w:w="50"/>
+              <w:left w:type="dxa" w:w="80"/>
+              <w:bottom w:type="dxa" w:w="50"/>
+              <w:right w:type="dxa" w:w="80"/>
+            </w:tcMar>
+            <w:vAlign w:val="top"/>
+          </w:tcPr>
+          <w:p>
+            <w:pPr>
+              <w:spacing w:after="0"/>
+              <w:jc w:val="center"/>
+            </w:pPr>
+            <w:r>
+              <w:rPr>
+                <w:rFonts w:ascii="Arial" w:cs="Arial" w:eastAsia="Arial" w:hAnsi="Arial"/>
+                <w:b w:val="false"/>
+                <w:bCs w:val="false"/>
+                <w:i w:val="false"/>
+                <w:iCs w:val="false"/>
+                <w:color w:val="474650"/>
+                <w:sz w:val="14"/>
+                <w:szCs w:val="14"/>
+              </w:rPr>
+              <w:t xml:space="preserve"/>
+            </w:r>
+          </w:p>
+        </w:tc>
+        <w:tc>
+          <w:tcPr>
+            <w:tcW w:type="dxa" w:w="800"/>
+            <w:tcBorders>
+              <w:top w:val="single" w:color="E0DFE6" w:sz="1"/>
+              <w:left w:val="single" w:color="E0DFE6" w:sz="1"/>
+              <w:bottom w:val="single" w:color="E0DFE6" w:sz="1"/>
+              <w:right w:val="single" w:color="E0DFE6" w:sz="1"/>
+            </w:tcBorders>
+            <w:shd w:fill="F8F8F8" w:val="clear"/>
+            <w:tcMar>
+              <w:top w:type="dxa" w:w="50"/>
+              <w:left w:type="dxa" w:w="80"/>
+              <w:bottom w:type="dxa" w:w="50"/>
+              <w:right w:type="dxa" w:w="80"/>
+            </w:tcMar>
+            <w:vAlign w:val="top"/>
+          </w:tcPr>
+          <w:p>
+            <w:pPr>
+              <w:spacing w:after="0"/>
+              <w:jc w:val="center"/>
+            </w:pPr>
+            <w:r>
+              <w:rPr>
+                <w:rFonts w:ascii="Arial" w:cs="Arial" w:eastAsia="Arial" w:hAnsi="Arial"/>
+                <w:b w:val="false"/>
+                <w:bCs w:val="false"/>
+                <w:i w:val="false"/>
+                <w:iCs w:val="false"/>
+                <w:color w:val="474650"/>
+                <w:sz w:val="14"/>
+                <w:szCs w:val="14"/>
+              </w:rPr>
+              <w:t xml:space="preserve"/>
+            </w:r>
+          </w:p>
+        </w:tc>
+        <w:tc>
+          <w:tcPr>
+            <w:tcW w:type="dxa" w:w="1080"/>
+            <w:tcBorders>
+              <w:top w:val="single" w:color="E0DFE6" w:sz="1"/>
+              <w:left w:val="single" w:color="E0DFE6" w:sz="1"/>
+              <w:bottom w:val="single" w:color="E0DFE6" w:sz="1"/>
+              <w:right w:val="single" w:color="E0DFE6" w:sz="1"/>
+            </w:tcBorders>
+            <w:shd w:fill="F8F8F8" w:val="clear"/>
+            <w:tcMar>
+              <w:top w:type="dxa" w:w="50"/>
+              <w:left w:type="dxa" w:w="80"/>
+              <w:bottom w:type="dxa" w:w="50"/>
+              <w:right w:type="dxa" w:w="80"/>
+            </w:tcMar>
+            <w:vAlign w:val="top"/>
+          </w:tcPr>
+          <w:p>
+            <w:pPr>
+              <w:spacing w:after="0"/>
+              <w:jc w:val="left"/>
+            </w:pPr>
+            <w:r>
+              <w:rPr>
+                <w:rFonts w:ascii="Arial" w:cs="Arial" w:eastAsia="Arial" w:hAnsi="Arial"/>
+                <w:b w:val="false"/>
+                <w:bCs w:val="false"/>
+                <w:i w:val="false"/>
+                <w:iCs w:val="false"/>
+                <w:color w:val="474650"/>
+                <w:sz w:val="14"/>
+                <w:szCs w:val="14"/>
+              </w:rPr>
+              <w:t xml:space="preserve"/>
+            </w:r>
+          </w:p>
+        </w:tc>
+      </w:tr>
+      <w:tr>
+        <w:tc>
+          <w:tcPr>
+            <w:tcW w:type="dxa" w:w="4600"/>
+            <w:tcBorders>
+              <w:top w:val="single" w:color="E0DFE6" w:sz="1"/>
+              <w:left w:val="single" w:color="E0DFE6" w:sz="1"/>
+              <w:bottom w:val="single" w:color="E0DFE6" w:sz="1"/>
+              <w:right w:val="single" w:color="E0DFE6" w:sz="1"/>
+            </w:tcBorders>
+            <w:shd w:fill="F8F8F8" w:val="clear"/>
+            <w:tcMar>
+              <w:top w:type="dxa" w:w="50"/>
+              <w:left w:type="dxa" w:w="80"/>
+              <w:bottom w:type="dxa" w:w="50"/>
+              <w:right w:type="dxa" w:w="80"/>
+            </w:tcMar>
+            <w:vAlign w:val="top"/>
+          </w:tcPr>
+          <w:p>
+            <w:pPr>
+              <w:spacing w:after="0"/>
+              <w:jc w:val="left"/>
+            </w:pPr>
+            <w:r>
+              <w:rPr>
+                <w:rFonts w:ascii="Arial" w:cs="Arial" w:eastAsia="Arial" w:hAnsi="Arial"/>
+                <w:b w:val="false"/>
+                <w:bCs w:val="false"/>
+                <w:i/>
+                <w:iCs/>
+                <w:color w:val="474650"/>
+                <w:sz w:val="14"/>
+                <w:szCs w:val="14"/>
+              </w:rPr>
+              <w:t xml:space="preserve">Read: Study Close-Out</w:t>
+            </w:r>
+          </w:p>
+        </w:tc>
+        <w:tc>
+          <w:tcPr>
+            <w:tcW w:type="dxa" w:w="2200"/>
+            <w:tcBorders>
+              <w:top w:val="single" w:color="E0DFE6" w:sz="1"/>
+              <w:left w:val="single" w:color="E0DFE6" w:sz="1"/>
+              <w:bottom w:val="single" w:color="E0DFE6" w:sz="1"/>
+              <w:right w:val="single" w:color="E0DFE6" w:sz="1"/>
+            </w:tcBorders>
+            <w:shd w:fill="F8F8F8" w:val="clear"/>
+            <w:tcMar>
+              <w:top w:type="dxa" w:w="50"/>
+              <w:left w:type="dxa" w:w="80"/>
+              <w:bottom w:type="dxa" w:w="50"/>
+              <w:right w:type="dxa" w:w="80"/>
+            </w:tcMar>
+            <w:vAlign w:val="top"/>
+          </w:tcPr>
+          <w:p>
+            <w:pPr>
+              <w:spacing w:after="0"/>
+              <w:jc w:val="left"/>
+            </w:pPr>
+            <w:hyperlink r:id="rId28">
+              <w:r>
+                <w:rPr>
+                  <w:color w:val="0563C1"/>
+                  <w:u w:val="single"/>
+                  <w:sz w:val="14"/>
+                  <w:szCs w:val="14"/>
+                  <w:rFonts w:ascii="Arial" w:hAnsi="Arial"/>
+                </w:rPr>
+                <w:t xml:space="preserve">Knowledge Base</w:t>
+              </w:r>
+            </w:hyperlink>
+          </w:p>
+        </w:tc>
+        <w:tc>
+          <w:tcPr>
+            <w:tcW w:type="dxa" w:w="1200"/>
+            <w:tcBorders>
+              <w:top w:val="single" w:color="E0DFE6" w:sz="1"/>
+              <w:left w:val="single" w:color="E0DFE6" w:sz="1"/>
+              <w:bottom w:val="single" w:color="E0DFE6" w:sz="1"/>
+              <w:right w:val="single" w:color="E0DFE6" w:sz="1"/>
+            </w:tcBorders>
+            <w:shd w:fill="F8F8F8" w:val="clear"/>
+            <w:tcMar>
+              <w:top w:type="dxa" w:w="50"/>
+              <w:left w:type="dxa" w:w="80"/>
+              <w:bottom w:type="dxa" w:w="50"/>
+              <w:right w:type="dxa" w:w="80"/>
+            </w:tcMar>
+            <w:vAlign w:val="top"/>
+          </w:tcPr>
+          <w:p>
+            <w:pPr>
+              <w:spacing w:after="0"/>
+              <w:jc w:val="center"/>
+            </w:pPr>
+            <w:r>
+              <w:rPr>
+                <w:rFonts w:ascii="Arial" w:cs="Arial" w:eastAsia="Arial" w:hAnsi="Arial"/>
+                <w:b w:val="false"/>
+                <w:bCs w:val="false"/>
+                <w:i w:val="false"/>
+                <w:iCs w:val="false"/>
+                <w:color w:val="474650"/>
+                <w:sz w:val="14"/>
+                <w:szCs w:val="14"/>
+              </w:rPr>
+              <w:t xml:space="preserve">Self-study</w:t>
+            </w:r>
+          </w:p>
+        </w:tc>
+        <w:tc>
+          <w:tcPr>
+            <w:tcW w:type="dxa" w:w="800"/>
+            <w:tcBorders>
+              <w:top w:val="single" w:color="E0DFE6" w:sz="1"/>
+              <w:left w:val="single" w:color="E0DFE6" w:sz="1"/>
+              <w:bottom w:val="single" w:color="E0DFE6" w:sz="1"/>
+              <w:right w:val="single" w:color="E0DFE6" w:sz="1"/>
+            </w:tcBorders>
+            <w:shd w:fill="F8F8F8" w:val="clear"/>
+            <w:tcMar>
+              <w:top w:type="dxa" w:w="50"/>
+              <w:left w:type="dxa" w:w="80"/>
+              <w:bottom w:type="dxa" w:w="50"/>
+              <w:right w:type="dxa" w:w="80"/>
+            </w:tcMar>
+            <w:vAlign w:val="top"/>
+          </w:tcPr>
+          <w:p>
+            <w:pPr>
+              <w:spacing w:after="0"/>
+              <w:jc w:val="center"/>
+            </w:pPr>
+            <w:r>
+              <w:rPr>
+                <w:rFonts w:ascii="Arial" w:cs="Arial" w:eastAsia="Arial" w:hAnsi="Arial"/>
+                <w:b w:val="false"/>
+                <w:bCs w:val="false"/>
+                <w:i w:val="false"/>
+                <w:iCs w:val="false"/>
+                <w:color w:val="474650"/>
+                <w:sz w:val="14"/>
+                <w:szCs w:val="14"/>
+              </w:rPr>
+              <w:t xml:space="preserve">All</w:t>
+            </w:r>
+          </w:p>
+        </w:tc>
+        <w:tc>
+          <w:tcPr>
+            <w:tcW w:type="dxa" w:w="1100"/>
+            <w:tcBorders>
+              <w:top w:val="single" w:color="E0DFE6" w:sz="1"/>
+              <w:left w:val="single" w:color="E0DFE6" w:sz="1"/>
+              <w:bottom w:val="single" w:color="E0DFE6" w:sz="1"/>
+              <w:right w:val="single" w:color="E0DFE6" w:sz="1"/>
+            </w:tcBorders>
+            <w:shd w:fill="F8F8F8" w:val="clear"/>
+            <w:tcMar>
+              <w:top w:type="dxa" w:w="50"/>
+              <w:left w:type="dxa" w:w="80"/>
+              <w:bottom w:type="dxa" w:w="50"/>
+              <w:right w:type="dxa" w:w="80"/>
+            </w:tcMar>
+            <w:vAlign w:val="top"/>
+          </w:tcPr>
+          <w:p>
+            <w:pPr>
+              <w:spacing w:after="0"/>
+              <w:jc w:val="left"/>
+            </w:pPr>
+            <w:r>
+              <w:rPr>
+                <w:rFonts w:ascii="Arial" w:cs="Arial" w:eastAsia="Arial" w:hAnsi="Arial"/>
+                <w:b w:val="false"/>
+                <w:bCs w:val="false"/>
+                <w:i w:val="false"/>
+                <w:iCs w:val="false"/>
+                <w:color w:val="474650"/>
+                <w:sz w:val="14"/>
+                <w:szCs w:val="14"/>
+              </w:rPr>
+              <w:t xml:space="preserve"/>
+            </w:r>
+          </w:p>
+        </w:tc>
+        <w:tc>
+          <w:tcPr>
+            <w:tcW w:type="dxa" w:w="1100"/>
+            <w:tcBorders>
+              <w:top w:val="single" w:color="E0DFE6" w:sz="1"/>
+              <w:left w:val="single" w:color="E0DFE6" w:sz="1"/>
+              <w:bottom w:val="single" w:color="E0DFE6" w:sz="1"/>
+              <w:right w:val="single" w:color="E0DFE6" w:sz="1"/>
+            </w:tcBorders>
+            <w:shd w:fill="F8F8F8" w:val="clear"/>
+            <w:tcMar>
+              <w:top w:type="dxa" w:w="50"/>
+              <w:left w:type="dxa" w:w="80"/>
+              <w:bottom w:type="dxa" w:w="50"/>
+              <w:right w:type="dxa" w:w="80"/>
+            </w:tcMar>
+            <w:vAlign w:val="top"/>
+          </w:tcPr>
+          <w:p>
+            <w:pPr>
+              <w:spacing w:after="0"/>
+              <w:jc w:val="left"/>
+            </w:pPr>
+            <w:r>
+              <w:rPr>
+                <w:rFonts w:ascii="Arial" w:cs="Arial" w:eastAsia="Arial" w:hAnsi="Arial"/>
+                <w:b w:val="false"/>
+                <w:bCs w:val="false"/>
+                <w:i w:val="false"/>
+                <w:iCs w:val="false"/>
+                <w:color w:val="474650"/>
+                <w:sz w:val="14"/>
+                <w:szCs w:val="14"/>
+              </w:rPr>
+              <w:t xml:space="preserve"/>
+            </w:r>
+          </w:p>
+        </w:tc>
+        <w:tc>
+          <w:tcPr>
+            <w:tcW w:type="dxa" w:w="800"/>
+            <w:tcBorders>
+              <w:top w:val="single" w:color="E0DFE6" w:sz="1"/>
+              <w:left w:val="single" w:color="E0DFE6" w:sz="1"/>
+              <w:bottom w:val="single" w:color="E0DFE6" w:sz="1"/>
+              <w:right w:val="single" w:color="E0DFE6" w:sz="1"/>
+            </w:tcBorders>
+            <w:shd w:fill="F8F8F8" w:val="clear"/>
+            <w:tcMar>
+              <w:top w:type="dxa" w:w="50"/>
+              <w:left w:type="dxa" w:w="80"/>
+              <w:bottom w:type="dxa" w:w="50"/>
+              <w:right w:type="dxa" w:w="80"/>
+            </w:tcMar>
+            <w:vAlign w:val="top"/>
+          </w:tcPr>
+          <w:p>
+            <w:pPr>
+              <w:spacing w:after="0"/>
+              <w:jc w:val="center"/>
+            </w:pPr>
+            <w:r>
+              <w:rPr>
+                <w:rFonts w:ascii="Arial" w:cs="Arial" w:eastAsia="Arial" w:hAnsi="Arial"/>
+                <w:b w:val="false"/>
+                <w:bCs w:val="false"/>
+                <w:i w:val="false"/>
+                <w:iCs w:val="false"/>
+                <w:color w:val="474650"/>
+                <w:sz w:val="14"/>
+                <w:szCs w:val="14"/>
+              </w:rPr>
+              <w:t xml:space="preserve"/>
+            </w:r>
+          </w:p>
+        </w:tc>
+        <w:tc>
+          <w:tcPr>
+            <w:tcW w:type="dxa" w:w="800"/>
+            <w:tcBorders>
+              <w:top w:val="single" w:color="E0DFE6" w:sz="1"/>
+              <w:left w:val="single" w:color="E0DFE6" w:sz="1"/>
+              <w:bottom w:val="single" w:color="E0DFE6" w:sz="1"/>
+              <w:right w:val="single" w:color="E0DFE6" w:sz="1"/>
+            </w:tcBorders>
+            <w:shd w:fill="F8F8F8" w:val="clear"/>
+            <w:tcMar>
+              <w:top w:type="dxa" w:w="50"/>
+              <w:left w:type="dxa" w:w="80"/>
+              <w:bottom w:type="dxa" w:w="50"/>
+              <w:right w:type="dxa" w:w="80"/>
+            </w:tcMar>
+            <w:vAlign w:val="top"/>
+          </w:tcPr>
+          <w:p>
+            <w:pPr>
+              <w:spacing w:after="0"/>
+              <w:jc w:val="center"/>
+            </w:pPr>
+            <w:r>
+              <w:rPr>
+                <w:rFonts w:ascii="Arial" w:cs="Arial" w:eastAsia="Arial" w:hAnsi="Arial"/>
+                <w:b w:val="false"/>
+                <w:bCs w:val="false"/>
+                <w:i w:val="false"/>
+                <w:iCs w:val="false"/>
+                <w:color w:val="474650"/>
+                <w:sz w:val="14"/>
+                <w:szCs w:val="14"/>
+              </w:rPr>
+              <w:t xml:space="preserve"/>
+            </w:r>
+          </w:p>
+        </w:tc>
+        <w:tc>
+          <w:tcPr>
+            <w:tcW w:type="dxa" w:w="1080"/>
+            <w:tcBorders>
+              <w:top w:val="single" w:color="E0DFE6" w:sz="1"/>
+              <w:left w:val="single" w:color="E0DFE6" w:sz="1"/>
+              <w:bottom w:val="single" w:color="E0DFE6" w:sz="1"/>
+              <w:right w:val="single" w:color="E0DFE6" w:sz="1"/>
+            </w:tcBorders>
+            <w:shd w:fill="F8F8F8" w:val="clear"/>
+            <w:tcMar>
+              <w:top w:type="dxa" w:w="50"/>
+              <w:left w:type="dxa" w:w="80"/>
+              <w:bottom w:type="dxa" w:w="50"/>
+              <w:right w:type="dxa" w:w="80"/>
+            </w:tcMar>
+            <w:vAlign w:val="top"/>
+          </w:tcPr>
+          <w:p>
+            <w:pPr>
+              <w:spacing w:after="0"/>
+              <w:jc w:val="left"/>
+            </w:pPr>
+            <w:r>
+              <w:rPr>
+                <w:rFonts w:ascii="Arial" w:cs="Arial" w:eastAsia="Arial" w:hAnsi="Arial"/>
+                <w:b w:val="false"/>
+                <w:bCs w:val="false"/>
+                <w:i w:val="false"/>
+                <w:iCs w:val="false"/>
+                <w:color w:val="474650"/>
+                <w:sz w:val="14"/>
+                <w:szCs w:val="14"/>
+              </w:rPr>
+              <w:t xml:space="preserve"/>
+            </w:r>
+          </w:p>
+        </w:tc>
+      </w:tr>
+      <w:tr>
+        <w:tc>
+          <w:tcPr>
             <w:tcW w:type="dxa" w:w="13680"/>
             <w:gridSpan w:val="9"/>
             <w:tcBorders>
@@ -22076,13 +24051,10 @@
               <w:spacing w:after="0"/>
               <w:jc w:val="left"/>
             </w:pPr>
-            <w:hyperlink w:history="1" r:id="rIdl-ainurqlsti8m1urp9w2">
+            <w:hyperlink r:id="rId11">
               <w:r>
                 <w:rPr>
-                  <w:rFonts w:ascii="Arial" w:cs="Arial" w:eastAsia="Arial" w:hAnsi="Arial"/>
-                  <w:color w:val="2B9CE2"/>
-                  <w:sz w:val="14"/>
-                  <w:szCs w:val="14"/>
+                  <w:color w:val="0563C1"/>
                   <w:u w:val="single"/>
                 </w:rPr>
                 <w:t xml:space="preserve">CANTRAIN</w:t>
@@ -22419,13 +24391,10 @@
               <w:spacing w:after="0"/>
               <w:jc w:val="left"/>
             </w:pPr>
-            <w:hyperlink w:history="1" r:id="rIdw-rxeku5ogjjrzn2ujqdn">
+            <w:hyperlink r:id="rId11">
               <w:r>
                 <w:rPr>
-                  <w:rFonts w:ascii="Arial" w:cs="Arial" w:eastAsia="Arial" w:hAnsi="Arial"/>
-                  <w:color w:val="2B9CE2"/>
-                  <w:sz w:val="14"/>
-                  <w:szCs w:val="14"/>
+                  <w:color w:val="0563C1"/>
                   <w:u w:val="single"/>
                 </w:rPr>
                 <w:t xml:space="preserve">CANTRAIN</w:t>
@@ -22762,13 +24731,10 @@
               <w:spacing w:after="0"/>
               <w:jc w:val="left"/>
             </w:pPr>
-            <w:hyperlink w:history="1" r:id="rIduk3odowh-k8vzkbbvaqcz">
+            <w:hyperlink r:id="rId23">
               <w:r>
                 <w:rPr>
-                  <w:rFonts w:ascii="Arial" w:cs="Arial" w:eastAsia="Arial" w:hAnsi="Arial"/>
-                  <w:color w:val="2B9CE2"/>
-                  <w:sz w:val="14"/>
-                  <w:szCs w:val="14"/>
+                  <w:color w:val="0563C1"/>
                   <w:u w:val="single"/>
                 </w:rPr>
                 <w:t xml:space="preserve">Learning Lab</w:t>

</xml_diff>